<commit_message>
docs(identite-enrolement-terminaux-01M52R6H): document Word de la mission 5a mis à jour (fusion, correctif post-fusion, CI verte)
Co-Authored-By: Claude Opus 5.5 <noreply@anthropic.com>
</commit_message>
<xml_diff>
--- a/docs/Mission-05a-Identite-enrolement-terminaux.docx
+++ b/docs/Mission-05a-Identite-enrolement-terminaux.docx
@@ -282,7 +282,7 @@
                 <w:sz w:val="19"/>
                 <w:szCs w:val="19"/>
               </w:rPr>
-              <w:t xml:space="preserve">20 octobre 2026</w:t>
+              <w:t xml:space="preserve">22 octobre 2026</w:t>
             </w:r>
           </w:p>
         </w:tc>
@@ -336,7 +336,7 @@
                 <w:sz w:val="19"/>
                 <w:szCs w:val="19"/>
               </w:rPr>
-              <w:t xml:space="preserve">En cours : 11 lots sur 18 approuvés ; 1 411 tests de l’API sur 1 411 verts sur la lane de WP11</w:t>
+              <w:t xml:space="preserve">Mergée le 21 octobre 2026 dans feat/identite-enrolement-terminaux (18 lots sur 18 approuvés) ; revue après fusion : PASS WITH NOTES ; correctif post-fusion n° 1 relu et approuvé ; demande de fusion vers main ouverte (PR #4)</w:t>
             </w:r>
           </w:p>
         </w:tc>
@@ -390,7 +390,7 @@
                 <w:sz w:val="19"/>
                 <w:szCs w:val="19"/>
               </w:rPr>
-              <w:t xml:space="preserve">kitty-specs/identite-enrolement-terminaux-01M52R6H/ (spec.md, plan.md, research.md, data-model.md, contracts/, tasks.md, analysis-report.md, decisions/, tasks/), docs/POINTS_OUVERTS.md, docs/DECISIONS_ADR.md, PROMPTS-A-ENVOYER.md</w:t>
+              <w:t xml:space="preserve">kitty-specs/identite-enrolement-terminaux-01M52R6H/ (spec.md, plan.md, research.md, data-model.md, contracts/, tasks.md, acceptance-matrix.json, reviews/, mission-review-report.md, post-merge-fix-1.md, post-merge-fix-1-review.md), docs/POINTS_OUVERTS.md, docs/DECISIONS_ADR.md, PROMPTS-A-ENVOYER.md</w:t>
             </w:r>
           </w:p>
         </w:tc>
@@ -427,11 +427,7 @@
       </w:pPr>
       <w:r>
         <w:fldChar w:fldCharType="begin" w:dirty="true"/>
-      </w:r>
-      <w:r>
         <w:instrText xml:space="preserve">TOC \h \o "1-2"</w:instrText>
-      </w:r>
-      <w:r>
         <w:fldChar w:fldCharType="separate"/>
       </w:r>
       <w:hyperlink w:anchor="_Toc1" w:history="1">
@@ -440,41 +436,11 @@
             <w:noProof/>
           </w:rPr>
           <w:t xml:space="preserve">1. Résumé</w:t>
-        </w:r>
-        <w:r>
-          <w:rPr>
-            <w:noProof/>
-          </w:rPr>
           <w:tab/>
-        </w:r>
-        <w:r>
-          <w:rPr>
-            <w:noProof/>
-          </w:rPr>
           <w:fldChar w:fldCharType="begin" w:dirty="true"/>
-        </w:r>
-        <w:r>
-          <w:rPr>
-            <w:noProof/>
-          </w:rPr>
           <w:instrText xml:space="preserve">PAGEREF _Toc1 \h</w:instrText>
-        </w:r>
-        <w:r>
-          <w:rPr>
-            <w:noProof/>
-          </w:rPr>
           <w:fldChar w:fldCharType="separate"/>
-        </w:r>
-        <w:r>
-          <w:rPr>
-            <w:noProof/>
-          </w:rPr>
           <w:t xml:space="preserve"> </w:t>
-        </w:r>
-        <w:r>
-          <w:rPr>
-            <w:noProof/>
-          </w:rPr>
           <w:fldChar w:fldCharType="end"/>
         </w:r>
       </w:hyperlink>
@@ -495,41 +461,11 @@
             <w:noProof/>
           </w:rPr>
           <w:t xml:space="preserve">Ce que la mission doit prouver, et ce qui l’est déjà</w:t>
-        </w:r>
-        <w:r>
-          <w:rPr>
-            <w:noProof/>
-          </w:rPr>
           <w:tab/>
-        </w:r>
-        <w:r>
-          <w:rPr>
-            <w:noProof/>
-          </w:rPr>
           <w:fldChar w:fldCharType="begin" w:dirty="true"/>
-        </w:r>
-        <w:r>
-          <w:rPr>
-            <w:noProof/>
-          </w:rPr>
           <w:instrText xml:space="preserve">PAGEREF _Toc2 \h</w:instrText>
-        </w:r>
-        <w:r>
-          <w:rPr>
-            <w:noProof/>
-          </w:rPr>
           <w:fldChar w:fldCharType="separate"/>
-        </w:r>
-        <w:r>
-          <w:rPr>
-            <w:noProof/>
-          </w:rPr>
           <w:t xml:space="preserve"> </w:t>
-        </w:r>
-        <w:r>
-          <w:rPr>
-            <w:noProof/>
-          </w:rPr>
           <w:fldChar w:fldCharType="end"/>
         </w:r>
       </w:hyperlink>
@@ -549,41 +485,11 @@
             <w:noProof/>
           </w:rPr>
           <w:t xml:space="preserve">2. Contexte et sources</w:t>
-        </w:r>
-        <w:r>
-          <w:rPr>
-            <w:noProof/>
-          </w:rPr>
           <w:tab/>
-        </w:r>
-        <w:r>
-          <w:rPr>
-            <w:noProof/>
-          </w:rPr>
           <w:fldChar w:fldCharType="begin" w:dirty="true"/>
-        </w:r>
-        <w:r>
-          <w:rPr>
-            <w:noProof/>
-          </w:rPr>
           <w:instrText xml:space="preserve">PAGEREF _Toc3 \h</w:instrText>
-        </w:r>
-        <w:r>
-          <w:rPr>
-            <w:noProof/>
-          </w:rPr>
           <w:fldChar w:fldCharType="separate"/>
-        </w:r>
-        <w:r>
-          <w:rPr>
-            <w:noProof/>
-          </w:rPr>
           <w:t xml:space="preserve"> </w:t>
-        </w:r>
-        <w:r>
-          <w:rPr>
-            <w:noProof/>
-          </w:rPr>
           <w:fldChar w:fldCharType="end"/>
         </w:r>
       </w:hyperlink>
@@ -603,41 +509,11 @@
             <w:noProof/>
           </w:rPr>
           <w:t xml:space="preserve">3. Périmètre</w:t>
-        </w:r>
-        <w:r>
-          <w:rPr>
-            <w:noProof/>
-          </w:rPr>
           <w:tab/>
-        </w:r>
-        <w:r>
-          <w:rPr>
-            <w:noProof/>
-          </w:rPr>
           <w:fldChar w:fldCharType="begin" w:dirty="true"/>
-        </w:r>
-        <w:r>
-          <w:rPr>
-            <w:noProof/>
-          </w:rPr>
           <w:instrText xml:space="preserve">PAGEREF _Toc4 \h</w:instrText>
-        </w:r>
-        <w:r>
-          <w:rPr>
-            <w:noProof/>
-          </w:rPr>
           <w:fldChar w:fldCharType="separate"/>
-        </w:r>
-        <w:r>
-          <w:rPr>
-            <w:noProof/>
-          </w:rPr>
           <w:t xml:space="preserve"> </w:t>
-        </w:r>
-        <w:r>
-          <w:rPr>
-            <w:noProof/>
-          </w:rPr>
           <w:fldChar w:fldCharType="end"/>
         </w:r>
       </w:hyperlink>
@@ -658,41 +534,11 @@
             <w:noProof/>
           </w:rPr>
           <w:t xml:space="preserve">Inclus</w:t>
-        </w:r>
-        <w:r>
-          <w:rPr>
-            <w:noProof/>
-          </w:rPr>
           <w:tab/>
-        </w:r>
-        <w:r>
-          <w:rPr>
-            <w:noProof/>
-          </w:rPr>
           <w:fldChar w:fldCharType="begin" w:dirty="true"/>
-        </w:r>
-        <w:r>
-          <w:rPr>
-            <w:noProof/>
-          </w:rPr>
           <w:instrText xml:space="preserve">PAGEREF _Toc5 \h</w:instrText>
-        </w:r>
-        <w:r>
-          <w:rPr>
-            <w:noProof/>
-          </w:rPr>
           <w:fldChar w:fldCharType="separate"/>
-        </w:r>
-        <w:r>
-          <w:rPr>
-            <w:noProof/>
-          </w:rPr>
           <w:t xml:space="preserve"> </w:t>
-        </w:r>
-        <w:r>
-          <w:rPr>
-            <w:noProof/>
-          </w:rPr>
           <w:fldChar w:fldCharType="end"/>
         </w:r>
       </w:hyperlink>
@@ -713,41 +559,11 @@
             <w:noProof/>
           </w:rPr>
           <w:t xml:space="preserve">Hors périmètre (missions suivantes)</w:t>
-        </w:r>
-        <w:r>
-          <w:rPr>
-            <w:noProof/>
-          </w:rPr>
           <w:tab/>
-        </w:r>
-        <w:r>
-          <w:rPr>
-            <w:noProof/>
-          </w:rPr>
           <w:fldChar w:fldCharType="begin" w:dirty="true"/>
-        </w:r>
-        <w:r>
-          <w:rPr>
-            <w:noProof/>
-          </w:rPr>
           <w:instrText xml:space="preserve">PAGEREF _Toc6 \h</w:instrText>
-        </w:r>
-        <w:r>
-          <w:rPr>
-            <w:noProof/>
-          </w:rPr>
           <w:fldChar w:fldCharType="separate"/>
-        </w:r>
-        <w:r>
-          <w:rPr>
-            <w:noProof/>
-          </w:rPr>
           <w:t xml:space="preserve"> </w:t>
-        </w:r>
-        <w:r>
-          <w:rPr>
-            <w:noProof/>
-          </w:rPr>
           <w:fldChar w:fldCharType="end"/>
         </w:r>
       </w:hyperlink>
@@ -767,41 +583,11 @@
             <w:noProof/>
           </w:rPr>
           <w:t xml:space="preserve">4. Décisions de cadrage</w:t>
-        </w:r>
-        <w:r>
-          <w:rPr>
-            <w:noProof/>
-          </w:rPr>
           <w:tab/>
-        </w:r>
-        <w:r>
-          <w:rPr>
-            <w:noProof/>
-          </w:rPr>
           <w:fldChar w:fldCharType="begin" w:dirty="true"/>
-        </w:r>
-        <w:r>
-          <w:rPr>
-            <w:noProof/>
-          </w:rPr>
           <w:instrText xml:space="preserve">PAGEREF _Toc7 \h</w:instrText>
-        </w:r>
-        <w:r>
-          <w:rPr>
-            <w:noProof/>
-          </w:rPr>
           <w:fldChar w:fldCharType="separate"/>
-        </w:r>
-        <w:r>
-          <w:rPr>
-            <w:noProof/>
-          </w:rPr>
           <w:t xml:space="preserve"> </w:t>
-        </w:r>
-        <w:r>
-          <w:rPr>
-            <w:noProof/>
-          </w:rPr>
           <w:fldChar w:fldCharType="end"/>
         </w:r>
       </w:hyperlink>
@@ -821,41 +607,11 @@
             <w:noProof/>
           </w:rPr>
           <w:t xml:space="preserve">5. Exigences</w:t>
-        </w:r>
-        <w:r>
-          <w:rPr>
-            <w:noProof/>
-          </w:rPr>
           <w:tab/>
-        </w:r>
-        <w:r>
-          <w:rPr>
-            <w:noProof/>
-          </w:rPr>
           <w:fldChar w:fldCharType="begin" w:dirty="true"/>
-        </w:r>
-        <w:r>
-          <w:rPr>
-            <w:noProof/>
-          </w:rPr>
           <w:instrText xml:space="preserve">PAGEREF _Toc8 \h</w:instrText>
-        </w:r>
-        <w:r>
-          <w:rPr>
-            <w:noProof/>
-          </w:rPr>
           <w:fldChar w:fldCharType="separate"/>
-        </w:r>
-        <w:r>
-          <w:rPr>
-            <w:noProof/>
-          </w:rPr>
           <w:t xml:space="preserve"> </w:t>
-        </w:r>
-        <w:r>
-          <w:rPr>
-            <w:noProof/>
-          </w:rPr>
           <w:fldChar w:fldCharType="end"/>
         </w:r>
       </w:hyperlink>
@@ -876,41 +632,11 @@
             <w:noProof/>
           </w:rPr>
           <w:t xml:space="preserve">5.1 Exigences fonctionnelles (26)</w:t>
-        </w:r>
-        <w:r>
-          <w:rPr>
-            <w:noProof/>
-          </w:rPr>
           <w:tab/>
-        </w:r>
-        <w:r>
-          <w:rPr>
-            <w:noProof/>
-          </w:rPr>
           <w:fldChar w:fldCharType="begin" w:dirty="true"/>
-        </w:r>
-        <w:r>
-          <w:rPr>
-            <w:noProof/>
-          </w:rPr>
           <w:instrText xml:space="preserve">PAGEREF _Toc9 \h</w:instrText>
-        </w:r>
-        <w:r>
-          <w:rPr>
-            <w:noProof/>
-          </w:rPr>
           <w:fldChar w:fldCharType="separate"/>
-        </w:r>
-        <w:r>
-          <w:rPr>
-            <w:noProof/>
-          </w:rPr>
           <w:t xml:space="preserve"> </w:t>
-        </w:r>
-        <w:r>
-          <w:rPr>
-            <w:noProof/>
-          </w:rPr>
           <w:fldChar w:fldCharType="end"/>
         </w:r>
       </w:hyperlink>
@@ -931,41 +657,11 @@
             <w:noProof/>
           </w:rPr>
           <w:t xml:space="preserve">5.2 Exigences non fonctionnelles (11)</w:t>
-        </w:r>
-        <w:r>
-          <w:rPr>
-            <w:noProof/>
-          </w:rPr>
           <w:tab/>
-        </w:r>
-        <w:r>
-          <w:rPr>
-            <w:noProof/>
-          </w:rPr>
           <w:fldChar w:fldCharType="begin" w:dirty="true"/>
-        </w:r>
-        <w:r>
-          <w:rPr>
-            <w:noProof/>
-          </w:rPr>
           <w:instrText xml:space="preserve">PAGEREF _Toc10 \h</w:instrText>
-        </w:r>
-        <w:r>
-          <w:rPr>
-            <w:noProof/>
-          </w:rPr>
           <w:fldChar w:fldCharType="separate"/>
-        </w:r>
-        <w:r>
-          <w:rPr>
-            <w:noProof/>
-          </w:rPr>
           <w:t xml:space="preserve"> </w:t>
-        </w:r>
-        <w:r>
-          <w:rPr>
-            <w:noProof/>
-          </w:rPr>
           <w:fldChar w:fldCharType="end"/>
         </w:r>
       </w:hyperlink>
@@ -986,41 +682,11 @@
             <w:noProof/>
           </w:rPr>
           <w:t xml:space="preserve">5.3 Contraintes (12)</w:t>
-        </w:r>
-        <w:r>
-          <w:rPr>
-            <w:noProof/>
-          </w:rPr>
           <w:tab/>
-        </w:r>
-        <w:r>
-          <w:rPr>
-            <w:noProof/>
-          </w:rPr>
           <w:fldChar w:fldCharType="begin" w:dirty="true"/>
-        </w:r>
-        <w:r>
-          <w:rPr>
-            <w:noProof/>
-          </w:rPr>
           <w:instrText xml:space="preserve">PAGEREF _Toc11 \h</w:instrText>
-        </w:r>
-        <w:r>
-          <w:rPr>
-            <w:noProof/>
-          </w:rPr>
           <w:fldChar w:fldCharType="separate"/>
-        </w:r>
-        <w:r>
-          <w:rPr>
-            <w:noProof/>
-          </w:rPr>
           <w:t xml:space="preserve"> </w:t>
-        </w:r>
-        <w:r>
-          <w:rPr>
-            <w:noProof/>
-          </w:rPr>
           <w:fldChar w:fldCharType="end"/>
         </w:r>
       </w:hyperlink>
@@ -1040,41 +706,11 @@
             <w:noProof/>
           </w:rPr>
           <w:t xml:space="preserve">6. Architecture retenue</w:t>
-        </w:r>
-        <w:r>
-          <w:rPr>
-            <w:noProof/>
-          </w:rPr>
           <w:tab/>
-        </w:r>
-        <w:r>
-          <w:rPr>
-            <w:noProof/>
-          </w:rPr>
           <w:fldChar w:fldCharType="begin" w:dirty="true"/>
-        </w:r>
-        <w:r>
-          <w:rPr>
-            <w:noProof/>
-          </w:rPr>
           <w:instrText xml:space="preserve">PAGEREF _Toc12 \h</w:instrText>
-        </w:r>
-        <w:r>
-          <w:rPr>
-            <w:noProof/>
-          </w:rPr>
           <w:fldChar w:fldCharType="separate"/>
-        </w:r>
-        <w:r>
-          <w:rPr>
-            <w:noProof/>
-          </w:rPr>
           <w:t xml:space="preserve"> </w:t>
-        </w:r>
-        <w:r>
-          <w:rPr>
-            <w:noProof/>
-          </w:rPr>
           <w:fldChar w:fldCharType="end"/>
         </w:r>
       </w:hyperlink>
@@ -1095,41 +731,11 @@
             <w:noProof/>
           </w:rPr>
           <w:t xml:space="preserve">6.1 Composants</w:t>
-        </w:r>
-        <w:r>
-          <w:rPr>
-            <w:noProof/>
-          </w:rPr>
           <w:tab/>
-        </w:r>
-        <w:r>
-          <w:rPr>
-            <w:noProof/>
-          </w:rPr>
           <w:fldChar w:fldCharType="begin" w:dirty="true"/>
-        </w:r>
-        <w:r>
-          <w:rPr>
-            <w:noProof/>
-          </w:rPr>
           <w:instrText xml:space="preserve">PAGEREF _Toc13 \h</w:instrText>
-        </w:r>
-        <w:r>
-          <w:rPr>
-            <w:noProof/>
-          </w:rPr>
           <w:fldChar w:fldCharType="separate"/>
-        </w:r>
-        <w:r>
-          <w:rPr>
-            <w:noProof/>
-          </w:rPr>
           <w:t xml:space="preserve"> </w:t>
-        </w:r>
-        <w:r>
-          <w:rPr>
-            <w:noProof/>
-          </w:rPr>
           <w:fldChar w:fldCharType="end"/>
         </w:r>
       </w:hyperlink>
@@ -1150,41 +756,11 @@
             <w:noProof/>
           </w:rPr>
           <w:t xml:space="preserve">6.2 Les trois preuves par requête</w:t>
-        </w:r>
-        <w:r>
-          <w:rPr>
-            <w:noProof/>
-          </w:rPr>
           <w:tab/>
-        </w:r>
-        <w:r>
-          <w:rPr>
-            <w:noProof/>
-          </w:rPr>
           <w:fldChar w:fldCharType="begin" w:dirty="true"/>
-        </w:r>
-        <w:r>
-          <w:rPr>
-            <w:noProof/>
-          </w:rPr>
           <w:instrText xml:space="preserve">PAGEREF _Toc14 \h</w:instrText>
-        </w:r>
-        <w:r>
-          <w:rPr>
-            <w:noProof/>
-          </w:rPr>
           <w:fldChar w:fldCharType="separate"/>
-        </w:r>
-        <w:r>
-          <w:rPr>
-            <w:noProof/>
-          </w:rPr>
           <w:t xml:space="preserve"> </w:t>
-        </w:r>
-        <w:r>
-          <w:rPr>
-            <w:noProof/>
-          </w:rPr>
           <w:fldChar w:fldCharType="end"/>
         </w:r>
       </w:hyperlink>
@@ -1205,41 +781,11 @@
             <w:noProof/>
           </w:rPr>
           <w:t xml:space="preserve">6.3 Chaîne d’un enrôlement</w:t>
-        </w:r>
-        <w:r>
-          <w:rPr>
-            <w:noProof/>
-          </w:rPr>
           <w:tab/>
-        </w:r>
-        <w:r>
-          <w:rPr>
-            <w:noProof/>
-          </w:rPr>
           <w:fldChar w:fldCharType="begin" w:dirty="true"/>
-        </w:r>
-        <w:r>
-          <w:rPr>
-            <w:noProof/>
-          </w:rPr>
           <w:instrText xml:space="preserve">PAGEREF _Toc15 \h</w:instrText>
-        </w:r>
-        <w:r>
-          <w:rPr>
-            <w:noProof/>
-          </w:rPr>
           <w:fldChar w:fldCharType="separate"/>
-        </w:r>
-        <w:r>
-          <w:rPr>
-            <w:noProof/>
-          </w:rPr>
           <w:t xml:space="preserve"> </w:t>
-        </w:r>
-        <w:r>
-          <w:rPr>
-            <w:noProof/>
-          </w:rPr>
           <w:fldChar w:fldCharType="end"/>
         </w:r>
       </w:hyperlink>
@@ -1260,41 +806,11 @@
             <w:noProof/>
           </w:rPr>
           <w:t xml:space="preserve">6.4 Décisions d’architecture</w:t>
-        </w:r>
-        <w:r>
-          <w:rPr>
-            <w:noProof/>
-          </w:rPr>
           <w:tab/>
-        </w:r>
-        <w:r>
-          <w:rPr>
-            <w:noProof/>
-          </w:rPr>
           <w:fldChar w:fldCharType="begin" w:dirty="true"/>
-        </w:r>
-        <w:r>
-          <w:rPr>
-            <w:noProof/>
-          </w:rPr>
           <w:instrText xml:space="preserve">PAGEREF _Toc16 \h</w:instrText>
-        </w:r>
-        <w:r>
-          <w:rPr>
-            <w:noProof/>
-          </w:rPr>
           <w:fldChar w:fldCharType="separate"/>
-        </w:r>
-        <w:r>
-          <w:rPr>
-            <w:noProof/>
-          </w:rPr>
           <w:t xml:space="preserve"> </w:t>
-        </w:r>
-        <w:r>
-          <w:rPr>
-            <w:noProof/>
-          </w:rPr>
           <w:fldChar w:fldCharType="end"/>
         </w:r>
       </w:hyperlink>
@@ -1314,41 +830,11 @@
             <w:noProof/>
           </w:rPr>
           <w:t xml:space="preserve">7. Points d’attention et contradictions</w:t>
-        </w:r>
-        <w:r>
-          <w:rPr>
-            <w:noProof/>
-          </w:rPr>
           <w:tab/>
-        </w:r>
-        <w:r>
-          <w:rPr>
-            <w:noProof/>
-          </w:rPr>
           <w:fldChar w:fldCharType="begin" w:dirty="true"/>
-        </w:r>
-        <w:r>
-          <w:rPr>
-            <w:noProof/>
-          </w:rPr>
           <w:instrText xml:space="preserve">PAGEREF _Toc17 \h</w:instrText>
-        </w:r>
-        <w:r>
-          <w:rPr>
-            <w:noProof/>
-          </w:rPr>
           <w:fldChar w:fldCharType="separate"/>
-        </w:r>
-        <w:r>
-          <w:rPr>
-            <w:noProof/>
-          </w:rPr>
           <w:t xml:space="preserve"> </w:t>
-        </w:r>
-        <w:r>
-          <w:rPr>
-            <w:noProof/>
-          </w:rPr>
           <w:fldChar w:fldCharType="end"/>
         </w:r>
       </w:hyperlink>
@@ -1369,41 +855,11 @@
             <w:noProof/>
           </w:rPr>
           <w:t xml:space="preserve">7.1 Dettes de sécurité acceptées</w:t>
-        </w:r>
-        <w:r>
-          <w:rPr>
-            <w:noProof/>
-          </w:rPr>
           <w:tab/>
-        </w:r>
-        <w:r>
-          <w:rPr>
-            <w:noProof/>
-          </w:rPr>
           <w:fldChar w:fldCharType="begin" w:dirty="true"/>
-        </w:r>
-        <w:r>
-          <w:rPr>
-            <w:noProof/>
-          </w:rPr>
           <w:instrText xml:space="preserve">PAGEREF _Toc18 \h</w:instrText>
-        </w:r>
-        <w:r>
-          <w:rPr>
-            <w:noProof/>
-          </w:rPr>
           <w:fldChar w:fldCharType="separate"/>
-        </w:r>
-        <w:r>
-          <w:rPr>
-            <w:noProof/>
-          </w:rPr>
           <w:t xml:space="preserve"> </w:t>
-        </w:r>
-        <w:r>
-          <w:rPr>
-            <w:noProof/>
-          </w:rPr>
           <w:fldChar w:fldCharType="end"/>
         </w:r>
       </w:hyperlink>
@@ -1424,41 +880,11 @@
             <w:noProof/>
           </w:rPr>
           <w:t xml:space="preserve">7.2 Résultat de l’analyse de cohérence</w:t>
-        </w:r>
-        <w:r>
-          <w:rPr>
-            <w:noProof/>
-          </w:rPr>
           <w:tab/>
-        </w:r>
-        <w:r>
-          <w:rPr>
-            <w:noProof/>
-          </w:rPr>
           <w:fldChar w:fldCharType="begin" w:dirty="true"/>
-        </w:r>
-        <w:r>
-          <w:rPr>
-            <w:noProof/>
-          </w:rPr>
           <w:instrText xml:space="preserve">PAGEREF _Toc19 \h</w:instrText>
-        </w:r>
-        <w:r>
-          <w:rPr>
-            <w:noProof/>
-          </w:rPr>
           <w:fldChar w:fldCharType="separate"/>
-        </w:r>
-        <w:r>
-          <w:rPr>
-            <w:noProof/>
-          </w:rPr>
           <w:t xml:space="preserve"> </w:t>
-        </w:r>
-        <w:r>
-          <w:rPr>
-            <w:noProof/>
-          </w:rPr>
           <w:fldChar w:fldCharType="end"/>
         </w:r>
       </w:hyperlink>
@@ -1479,41 +905,11 @@
             <w:noProof/>
           </w:rPr>
           <w:t xml:space="preserve">7.3 Constats pendant l’implémentation</w:t>
-        </w:r>
-        <w:r>
-          <w:rPr>
-            <w:noProof/>
-          </w:rPr>
           <w:tab/>
-        </w:r>
-        <w:r>
-          <w:rPr>
-            <w:noProof/>
-          </w:rPr>
           <w:fldChar w:fldCharType="begin" w:dirty="true"/>
-        </w:r>
-        <w:r>
-          <w:rPr>
-            <w:noProof/>
-          </w:rPr>
           <w:instrText xml:space="preserve">PAGEREF _Toc20 \h</w:instrText>
-        </w:r>
-        <w:r>
-          <w:rPr>
-            <w:noProof/>
-          </w:rPr>
           <w:fldChar w:fldCharType="separate"/>
-        </w:r>
-        <w:r>
-          <w:rPr>
-            <w:noProof/>
-          </w:rPr>
           <w:t xml:space="preserve"> </w:t>
-        </w:r>
-        <w:r>
-          <w:rPr>
-            <w:noProof/>
-          </w:rPr>
           <w:fldChar w:fldCharType="end"/>
         </w:r>
       </w:hyperlink>
@@ -1534,41 +930,11 @@
             <w:noProof/>
           </w:rPr>
           <w:t xml:space="preserve">7.4 Relecture</w:t>
-        </w:r>
-        <w:r>
-          <w:rPr>
-            <w:noProof/>
-          </w:rPr>
           <w:tab/>
-        </w:r>
-        <w:r>
-          <w:rPr>
-            <w:noProof/>
-          </w:rPr>
           <w:fldChar w:fldCharType="begin" w:dirty="true"/>
-        </w:r>
-        <w:r>
-          <w:rPr>
-            <w:noProof/>
-          </w:rPr>
           <w:instrText xml:space="preserve">PAGEREF _Toc21 \h</w:instrText>
-        </w:r>
-        <w:r>
-          <w:rPr>
-            <w:noProof/>
-          </w:rPr>
           <w:fldChar w:fldCharType="separate"/>
-        </w:r>
-        <w:r>
-          <w:rPr>
-            <w:noProof/>
-          </w:rPr>
           <w:t xml:space="preserve"> </w:t>
-        </w:r>
-        <w:r>
-          <w:rPr>
-            <w:noProof/>
-          </w:rPr>
           <w:fldChar w:fldCharType="end"/>
         </w:r>
       </w:hyperlink>
@@ -1588,41 +954,11 @@
             <w:noProof/>
           </w:rPr>
           <w:t xml:space="preserve">8. Plan de travail</w:t>
-        </w:r>
-        <w:r>
-          <w:rPr>
-            <w:noProof/>
-          </w:rPr>
           <w:tab/>
-        </w:r>
-        <w:r>
-          <w:rPr>
-            <w:noProof/>
-          </w:rPr>
           <w:fldChar w:fldCharType="begin" w:dirty="true"/>
-        </w:r>
-        <w:r>
-          <w:rPr>
-            <w:noProof/>
-          </w:rPr>
           <w:instrText xml:space="preserve">PAGEREF _Toc22 \h</w:instrText>
-        </w:r>
-        <w:r>
-          <w:rPr>
-            <w:noProof/>
-          </w:rPr>
           <w:fldChar w:fldCharType="separate"/>
-        </w:r>
-        <w:r>
-          <w:rPr>
-            <w:noProof/>
-          </w:rPr>
           <w:t xml:space="preserve"> </w:t>
-        </w:r>
-        <w:r>
-          <w:rPr>
-            <w:noProof/>
-          </w:rPr>
           <w:fldChar w:fldCharType="end"/>
         </w:r>
       </w:hyperlink>
@@ -1643,41 +979,11 @@
             <w:noProof/>
           </w:rPr>
           <w:t xml:space="preserve">Ordre et parallélisme</w:t>
-        </w:r>
-        <w:r>
-          <w:rPr>
-            <w:noProof/>
-          </w:rPr>
           <w:tab/>
-        </w:r>
-        <w:r>
-          <w:rPr>
-            <w:noProof/>
-          </w:rPr>
           <w:fldChar w:fldCharType="begin" w:dirty="true"/>
-        </w:r>
-        <w:r>
-          <w:rPr>
-            <w:noProof/>
-          </w:rPr>
           <w:instrText xml:space="preserve">PAGEREF _Toc23 \h</w:instrText>
-        </w:r>
-        <w:r>
-          <w:rPr>
-            <w:noProof/>
-          </w:rPr>
           <w:fldChar w:fldCharType="separate"/>
-        </w:r>
-        <w:r>
-          <w:rPr>
-            <w:noProof/>
-          </w:rPr>
           <w:t xml:space="preserve"> </w:t>
-        </w:r>
-        <w:r>
-          <w:rPr>
-            <w:noProof/>
-          </w:rPr>
           <w:fldChar w:fldCharType="end"/>
         </w:r>
       </w:hyperlink>
@@ -1697,41 +1003,11 @@
             <w:noProof/>
           </w:rPr>
           <w:t xml:space="preserve">9. Avancement et prochaines étapes</w:t>
-        </w:r>
-        <w:r>
-          <w:rPr>
-            <w:noProof/>
-          </w:rPr>
           <w:tab/>
-        </w:r>
-        <w:r>
-          <w:rPr>
-            <w:noProof/>
-          </w:rPr>
           <w:fldChar w:fldCharType="begin" w:dirty="true"/>
-        </w:r>
-        <w:r>
-          <w:rPr>
-            <w:noProof/>
-          </w:rPr>
           <w:instrText xml:space="preserve">PAGEREF _Toc24 \h</w:instrText>
-        </w:r>
-        <w:r>
-          <w:rPr>
-            <w:noProof/>
-          </w:rPr>
           <w:fldChar w:fldCharType="separate"/>
-        </w:r>
-        <w:r>
-          <w:rPr>
-            <w:noProof/>
-          </w:rPr>
           <w:t xml:space="preserve"> </w:t>
-        </w:r>
-        <w:r>
-          <w:rPr>
-            <w:noProof/>
-          </w:rPr>
           <w:fldChar w:fldCharType="end"/>
         </w:r>
       </w:hyperlink>
@@ -1791,7 +1067,7 @@
         <w:spacing w:after="120"/>
       </w:pPr>
       <w:r>
-        <w:t xml:space="preserve">État au 20 octobre 2026 : mission en cours. 11 lots de travail sur 18 sont approuvés après relecture indépendante. Les lots sont dans des lanes séparées (kitty/mission-…-lane-x), pas encore fusionnés dans feat/identite-enrolement-terminaux. Ce document sera mis à jour à la fin de la mission.</w:t>
+        <w:t xml:space="preserve">État au 22 octobre 2026 : mission terminée. Les 18 lots sont approuvés après relecture indépendante, acceptés (26 exigences fonctionnelles et 12 invariants vérifiés) et fusionnés le 21 octobre dans feat/identite-enrolement-terminaux. La revue après fusion rend PASS WITH NOTES ; ses deux renforcements (SEC-2, DRIFT-2) sont faits par le correctif post-fusion n° 1, relu et approuvé. La demande de fusion vers main est ouverte (PR #4).</w:t>
       </w:r>
     </w:p>
     <w:p>
@@ -1814,7 +1090,7 @@
         <w:spacing w:after="60"/>
       </w:pPr>
       <w:r>
-        <w:t xml:space="preserve">Aucune preuve seule ne suffit : une requête à qui il manque le certificat, le jeton ou la signature, ou dont une preuve est fausse, expirée ou d’un autre terminal, est refusée. Les pièces sont faites (jetons au lot 9, attestations aux lots 10 et 11, nonces au lot 4) ; la vérification des trois preuves est au lot 12 et la matrice de tests au lot 18.</w:t>
+        <w:t xml:space="preserve">Aucune preuve seule ne suffit : fait. Une requête à qui il manque le certificat, le jeton ou la signature, ou dont une preuve est fausse, expirée, rejouée ou d’un autre terminal, est refusée sur chaque route de terminal (matrice route × preuve du lot 18, device-auth-matrix.spec.ts).</w:t>
       </w:r>
     </w:p>
     <w:p>
@@ -1827,7 +1103,7 @@
         <w:spacing w:after="60"/>
       </w:pPr>
       <w:r>
-        <w:t xml:space="preserve">Révocation immédiate : un terminal révoqué n’obtient plus rien dès la requête suivante. Fait en base (statut relu, fonction assert_device_active, famille de jetons révoquée, lots 3 et 4) ; la preuve par l’API est aux lots 12, 16 et 18.</w:t>
+        <w:t xml:space="preserve">Révocation immédiate : fait. Un terminal suspendu ou révoqué est refusé dès la requête suivante, sur chaque route (403 DEVICE_REVOKED après preuves valides, ADR-115) ; statut relu en base à chaque requête et famille de jetons révoquée.</w:t>
       </w:r>
     </w:p>
     <w:p>
@@ -1840,7 +1116,7 @@
         <w:spacing w:after="60"/>
       </w:pPr>
       <w:r>
-        <w:t xml:space="preserve">Dettes levées, chacune avec son test : OP-N59 (migration 0021, détournement prouvé sur les 7 fonctions tenant_of_*), OP-N50 (0024), OP-N62 (0025) et OP-N54 (empreinte à clé) sont faites ; les droits de la base (OP-N44, fin d’OP-N59, OP-N62 et OP-N63) sont au lot 7, en cours ; OP-N42 est au lot 12.</w:t>
+        <w:t xml:space="preserve">Dettes levées, chacune avec son test : OP-N42, OP-N44, OP-N50, OP-N54, OP-N59, OP-N62 et OP-N63, plus OP-N70 et OP-N71 apparus pendant la mission. Les trois qui bloquaient la production (OP-N42, OP-N59, OP-N63) sont levées.</w:t>
       </w:r>
     </w:p>
     <w:p>
@@ -1853,7 +1129,7 @@
         <w:spacing w:after="60"/>
       </w:pPr>
       <w:r>
-        <w:t xml:space="preserve">Aucun secret en clair au repos : seules des empreintes de codes et de jetons sont stockées (lots 3, 4 et 13). La recherche des valeurs de test dans la base et les journaux après un parcours complet est au lot 18.</w:t>
+        <w:t xml:space="preserve">Aucun secret en clair au repos : fait. Seules des empreintes de codes et de jetons sont stockées ; après un parcours complet, aucune valeur de test n’est retrouvée dans la base, les journaux ni les réponses d’erreur (device-secrets.spec.ts). Depuis le correctif post-fusion, l’API ne peut même plus lire l’empreinte des codes d’enrôlement (SEC-2).</w:t>
       </w:r>
     </w:p>
     <w:p>
@@ -1866,7 +1142,7 @@
         <w:spacing w:after="60"/>
       </w:pPr>
       <w:r>
-        <w:t xml:space="preserve">Aucun faux en production : la garde de démarrage refuse les faux d’autorité, de signataire et d’attestation, une racine de test et l’environnement de développement d’Apple (lots 8 à 11). La preuve de bout en bout pour le faux d’attestation est au lot 14.</w:t>
+        <w:t xml:space="preserve">Aucun faux en production : fait. La garde de démarrage refuse chaque faux (autorité, signataire, attestation, terminal de test) et l’environnement de développement d’Apple, un test par faux. L’autorité et le signataire n’ont pas encore d’adaptateur réel : la mise en production attend la mission 7 (OP-N73).</w:t>
       </w:r>
     </w:p>
     <w:p>
@@ -1879,7 +1155,7 @@
         <w:spacing w:after="60"/>
       </w:pPr>
       <w:r>
-        <w:t xml:space="preserve">Isolation entre prestataires : prouvée en base, en lecture et en écriture, sur les nouvelles tables (lots 3 et 4) ; à prouver sur chaque route aux lots 14 à 18.</w:t>
+        <w:t xml:space="preserve">Isolation entre prestataires : fait, en base sur les nouvelles tables et sur chaque route (device-isolation.spec.ts).</w:t>
       </w:r>
     </w:p>
     <w:p>
@@ -1892,7 +1168,7 @@
         <w:spacing w:after="60"/>
       </w:pPr>
       <w:r>
-        <w:t xml:space="preserve">Suites vertes : 1 411 tests de l’API sur 1 411 sur la lane de WP11 (après WP10 et WP11), 1 322 sur 1 322 sur celle de WP13. Le total des assertions de la base n’est pas relevé dans les sources pour cette mission.</w:t>
+        <w:t xml:space="preserve">Suites vertes : pgTAP 2083 sur 2083 et 1704 tests de l’API réussis (6 ignorés) au correctif post-fusion ; mesures de latence 17 sur 17 (surcoût des trois preuves p95 17,3 ms pour 20 ms permis). GitHub Actions vert sur la branche le 22 octobre 2026 (run 39762590535) : pgTAP 2083/2083, Jest 1705 réussis et 6 ignorés, bibliothèque de format 39/39, mesures de latence en série vertes (NFR-011 tenue).</w:t>
       </w:r>
     </w:p>
     <w:p>
@@ -3213,7 +2489,7 @@
                 <w:sz w:val="19"/>
                 <w:szCs w:val="19"/>
               </w:rPr>
-              <w:t xml:space="preserve">Le paiement de la mission 5b repose sur une lecture qui ne sert qu’une fois</w:t>
+              <w:t xml:space="preserve">Levée : migrations 0024 et 0026 (lots 5 et 7)</w:t>
             </w:r>
           </w:p>
         </w:tc>
@@ -7333,7 +6609,7 @@
                 <w:sz w:val="19"/>
                 <w:szCs w:val="19"/>
               </w:rPr>
-              <w:t xml:space="preserve">Migrations 0021 (search_path des fonctions privilégiées), 0022 (codes, enrôlement, statut, serial par prestataire), 0023 (jetons, familles, nonces, garde de statut), 0024 (consume_tap), 0025 (retrait de clé) ; post-roles.sql (droits rôle par rôle) ; gen_tests.py ; nouvelles suites pgTAP</w:t>
+              <w:t xml:space="preserve">Migrations 0021 (search_path des fonctions privilégiées), 0022 (codes, enrôlement, statut, serial par prestataire), 0023 (jetons, familles, nonces, garde de statut), 0024 et 0026 (consume_tap), 0025 (retrait de clé), 0027 (audit de tous les refus d’enrôlement), 0029 (configuration servie durcie), 0030 (limites d’enrôlement atomiques) ; post-roles.sql (droits rôle par rôle, empreinte des codes illisible par l’API) ; gen_tests.py ; nouvelles suites pgTAP</w:t>
             </w:r>
           </w:p>
         </w:tc>
@@ -9321,7 +8597,7 @@
         <w:spacing w:after="120"/>
       </w:pPr>
       <w:r>
-        <w:t xml:space="preserve">Chaque écart accepté est consigné dans docs/POINTS_OUVERTS.md et docs/DECISIONS_ADR.md, avec son risque, la mission qui le lève et la condition de levée. Aucun ne bloque la production.</w:t>
+        <w:t xml:space="preserve">Chaque écart accepté est consigné dans docs/POINTS_OUVERTS.md et docs/DECISIONS_ADR.md, avec son risque, la mission qui le lève et la condition de levée. Un seul bloque la production : OP-N73 (autorité et signataire sans adaptateur réel). Pour OP-N68 et OP-N69, la réponse « bloque la production » attend encore le porteur.</w:t>
       </w:r>
     </w:p>
     <w:tbl>
@@ -9697,7 +8973,7 @@
                 <w:sz w:val="19"/>
                 <w:szCs w:val="19"/>
               </w:rPr>
-              <w:t xml:space="preserve">Faux de l’autorité, du signataire et de l’attestation</w:t>
+              <w:t xml:space="preserve">OP-N73 (ADR-119)</w:t>
             </w:r>
           </w:p>
         </w:tc>
@@ -9723,7 +8999,7 @@
                 <w:sz w:val="19"/>
                 <w:szCs w:val="19"/>
               </w:rPr>
-              <w:t xml:space="preserve">Les adaptateurs réels n’existent pas</w:t>
+              <w:t xml:space="preserve">L’autorité des terminaux et le signataire des jetons d’appareil n’existent qu’en faux</w:t>
             </w:r>
           </w:p>
         </w:tc>
@@ -9749,7 +9025,487 @@
                 <w:sz w:val="19"/>
                 <w:szCs w:val="19"/>
               </w:rPr>
-              <w:t xml:space="preserve">Refus de démarrer en production ; levée par les adaptateurs réels (OP-N11)</w:t>
+              <w:t xml:space="preserve">Refus de démarrer en production ; bloque la production ; levée par la mission 7, avec le service de clés</w:t>
+            </w:r>
+          </w:p>
+        </w:tc>
+      </w:tr>
+      <w:tr>
+        <w:tc>
+          <w:tcPr>
+            <w:tcW w:w="1200" w:type="dxa"/>
+            <w:tcBorders>
+              <w:top w:val="single" w:sz="4" w:space="0" w:color="A6A6A6"/>
+              <w:left w:val="single" w:sz="4" w:space="0" w:color="A6A6A6"/>
+              <w:bottom w:val="single" w:sz="4" w:space="0" w:color="A6A6A6"/>
+              <w:right w:val="single" w:sz="4" w:space="0" w:color="A6A6A6"/>
+            </w:tcBorders>
+            <w:tcMar>
+              <w:top w:w="60" w:type="dxa"/>
+              <w:left w:w="90" w:type="dxa"/>
+              <w:bottom w:w="60" w:type="dxa"/>
+              <w:right w:w="90" w:type="dxa"/>
+            </w:tcMar>
+          </w:tcPr>
+          <w:p>
+            <w:r>
+              <w:rPr>
+                <w:sz w:val="19"/>
+                <w:szCs w:val="19"/>
+              </w:rPr>
+              <w:t xml:space="preserve">OP-N68 (ADR-111)</w:t>
+            </w:r>
+          </w:p>
+        </w:tc>
+        <w:tc>
+          <w:tcPr>
+            <w:tcW w:w="4000" w:type="dxa"/>
+            <w:tcBorders>
+              <w:top w:val="single" w:sz="4" w:space="0" w:color="A6A6A6"/>
+              <w:left w:val="single" w:sz="4" w:space="0" w:color="A6A6A6"/>
+              <w:bottom w:val="single" w:sz="4" w:space="0" w:color="A6A6A6"/>
+              <w:right w:val="single" w:sz="4" w:space="0" w:color="A6A6A6"/>
+            </w:tcBorders>
+            <w:tcMar>
+              <w:top w:w="60" w:type="dxa"/>
+              <w:left w:w="90" w:type="dxa"/>
+              <w:bottom w:w="60" w:type="dxa"/>
+              <w:right w:w="90" w:type="dxa"/>
+            </w:tcMar>
+          </w:tcPr>
+          <w:p>
+            <w:r>
+              <w:rPr>
+                <w:sz w:val="19"/>
+                <w:szCs w:val="19"/>
+              </w:rPr>
+              <w:t xml:space="preserve">Une fonction créée hors de migrate.ts reste exécutable par PUBLIC jusqu’au rejeu des droits</w:t>
+            </w:r>
+          </w:p>
+        </w:tc>
+        <w:tc>
+          <w:tcPr>
+            <w:tcW w:w="4438" w:type="dxa"/>
+            <w:tcBorders>
+              <w:top w:val="single" w:sz="4" w:space="0" w:color="A6A6A6"/>
+              <w:left w:val="single" w:sz="4" w:space="0" w:color="A6A6A6"/>
+              <w:bottom w:val="single" w:sz="4" w:space="0" w:color="A6A6A6"/>
+              <w:right w:val="single" w:sz="4" w:space="0" w:color="A6A6A6"/>
+            </w:tcBorders>
+            <w:tcMar>
+              <w:top w:w="60" w:type="dxa"/>
+              <w:left w:w="90" w:type="dxa"/>
+              <w:bottom w:w="60" w:type="dxa"/>
+              <w:right w:w="90" w:type="dxa"/>
+            </w:tcMar>
+          </w:tcPr>
+          <w:p>
+            <w:r>
+              <w:rPr>
+                <w:sz w:val="19"/>
+                <w:szCs w:val="19"/>
+              </w:rPr>
+              <w:t xml:space="preserve">Droits rejoués dans la transaction des migrations ; levée par la mission 7 (droit par défaut)</w:t>
+            </w:r>
+          </w:p>
+        </w:tc>
+      </w:tr>
+      <w:tr>
+        <w:tc>
+          <w:tcPr>
+            <w:tcW w:w="1200" w:type="dxa"/>
+            <w:tcBorders>
+              <w:top w:val="single" w:sz="4" w:space="0" w:color="A6A6A6"/>
+              <w:left w:val="single" w:sz="4" w:space="0" w:color="A6A6A6"/>
+              <w:bottom w:val="single" w:sz="4" w:space="0" w:color="A6A6A6"/>
+              <w:right w:val="single" w:sz="4" w:space="0" w:color="A6A6A6"/>
+            </w:tcBorders>
+            <w:tcMar>
+              <w:top w:w="60" w:type="dxa"/>
+              <w:left w:w="90" w:type="dxa"/>
+              <w:bottom w:w="60" w:type="dxa"/>
+              <w:right w:w="90" w:type="dxa"/>
+            </w:tcMar>
+          </w:tcPr>
+          <w:p>
+            <w:r>
+              <w:rPr>
+                <w:sz w:val="19"/>
+                <w:szCs w:val="19"/>
+              </w:rPr>
+              <w:t xml:space="preserve">OP-N69 (ADR-112)</w:t>
+            </w:r>
+          </w:p>
+        </w:tc>
+        <w:tc>
+          <w:tcPr>
+            <w:tcW w:w="4000" w:type="dxa"/>
+            <w:tcBorders>
+              <w:top w:val="single" w:sz="4" w:space="0" w:color="A6A6A6"/>
+              <w:left w:val="single" w:sz="4" w:space="0" w:color="A6A6A6"/>
+              <w:bottom w:val="single" w:sz="4" w:space="0" w:color="A6A6A6"/>
+              <w:right w:val="single" w:sz="4" w:space="0" w:color="A6A6A6"/>
+            </w:tcBorders>
+            <w:tcMar>
+              <w:top w:w="60" w:type="dxa"/>
+              <w:left w:w="90" w:type="dxa"/>
+              <w:bottom w:w="60" w:type="dxa"/>
+              <w:right w:w="90" w:type="dxa"/>
+            </w:tcMar>
+          </w:tcPr>
+          <w:p>
+            <w:r>
+              <w:rPr>
+                <w:sz w:val="19"/>
+                <w:szCs w:val="19"/>
+              </w:rPr>
+              <w:t xml:space="preserve">L’API écrit encore directement la numérotation, la présence et l’affectation d’un terminal</w:t>
+            </w:r>
+          </w:p>
+        </w:tc>
+        <w:tc>
+          <w:tcPr>
+            <w:tcW w:w="4438" w:type="dxa"/>
+            <w:tcBorders>
+              <w:top w:val="single" w:sz="4" w:space="0" w:color="A6A6A6"/>
+              <w:left w:val="single" w:sz="4" w:space="0" w:color="A6A6A6"/>
+              <w:bottom w:val="single" w:sz="4" w:space="0" w:color="A6A6A6"/>
+              <w:right w:val="single" w:sz="4" w:space="0" w:color="A6A6A6"/>
+            </w:tcBorders>
+            <w:tcMar>
+              <w:top w:w="60" w:type="dxa"/>
+              <w:left w:w="90" w:type="dxa"/>
+              <w:bottom w:w="60" w:type="dxa"/>
+              <w:right w:w="90" w:type="dxa"/>
+            </w:tcMar>
+          </w:tcPr>
+          <w:p>
+            <w:r>
+              <w:rPr>
+                <w:sz w:val="19"/>
+                <w:szCs w:val="19"/>
+              </w:rPr>
+              <w:t xml:space="preserve">Colonnes nommées une à une, test de la liste exacte ; levée par la mission 7</w:t>
+            </w:r>
+          </w:p>
+        </w:tc>
+      </w:tr>
+      <w:tr>
+        <w:tc>
+          <w:tcPr>
+            <w:tcW w:w="1200" w:type="dxa"/>
+            <w:tcBorders>
+              <w:top w:val="single" w:sz="4" w:space="0" w:color="A6A6A6"/>
+              <w:left w:val="single" w:sz="4" w:space="0" w:color="A6A6A6"/>
+              <w:bottom w:val="single" w:sz="4" w:space="0" w:color="A6A6A6"/>
+              <w:right w:val="single" w:sz="4" w:space="0" w:color="A6A6A6"/>
+            </w:tcBorders>
+            <w:tcMar>
+              <w:top w:w="60" w:type="dxa"/>
+              <w:left w:w="90" w:type="dxa"/>
+              <w:bottom w:w="60" w:type="dxa"/>
+              <w:right w:w="90" w:type="dxa"/>
+            </w:tcMar>
+          </w:tcPr>
+          <w:p>
+            <w:r>
+              <w:rPr>
+                <w:sz w:val="19"/>
+                <w:szCs w:val="19"/>
+              </w:rPr>
+              <w:t xml:space="preserve">OP-N72</w:t>
+            </w:r>
+          </w:p>
+        </w:tc>
+        <w:tc>
+          <w:tcPr>
+            <w:tcW w:w="4000" w:type="dxa"/>
+            <w:tcBorders>
+              <w:top w:val="single" w:sz="4" w:space="0" w:color="A6A6A6"/>
+              <w:left w:val="single" w:sz="4" w:space="0" w:color="A6A6A6"/>
+              <w:bottom w:val="single" w:sz="4" w:space="0" w:color="A6A6A6"/>
+              <w:right w:val="single" w:sz="4" w:space="0" w:color="A6A6A6"/>
+            </w:tcBorders>
+            <w:tcMar>
+              <w:top w:w="60" w:type="dxa"/>
+              <w:left w:w="90" w:type="dxa"/>
+              <w:bottom w:w="60" w:type="dxa"/>
+              <w:right w:w="90" w:type="dxa"/>
+            </w:tcMar>
+          </w:tcPr>
+          <w:p>
+            <w:r>
+              <w:rPr>
+                <w:sz w:val="19"/>
+                <w:szCs w:val="19"/>
+              </w:rPr>
+              <w:t xml:space="preserve">Aucune limite en amont de l’enrôlement ; la chaîne d’audit de la plateforme est sollicitée par les refus</w:t>
+            </w:r>
+          </w:p>
+        </w:tc>
+        <w:tc>
+          <w:tcPr>
+            <w:tcW w:w="4438" w:type="dxa"/>
+            <w:tcBorders>
+              <w:top w:val="single" w:sz="4" w:space="0" w:color="A6A6A6"/>
+              <w:left w:val="single" w:sz="4" w:space="0" w:color="A6A6A6"/>
+              <w:bottom w:val="single" w:sz="4" w:space="0" w:color="A6A6A6"/>
+              <w:right w:val="single" w:sz="4" w:space="0" w:color="A6A6A6"/>
+            </w:tcBorders>
+            <w:tcMar>
+              <w:top w:w="60" w:type="dxa"/>
+              <w:left w:w="90" w:type="dxa"/>
+              <w:bottom w:w="60" w:type="dxa"/>
+              <w:right w:w="90" w:type="dxa"/>
+            </w:tcMar>
+          </w:tcPr>
+          <w:p>
+            <w:r>
+              <w:rPr>
+                <w:sz w:val="19"/>
+                <w:szCs w:val="19"/>
+              </w:rPr>
+              <w:t xml:space="preserve">Limites atomiques sur les refus (ADR-117) ; levée par la mission 13</w:t>
+            </w:r>
+          </w:p>
+        </w:tc>
+      </w:tr>
+      <w:tr>
+        <w:tc>
+          <w:tcPr>
+            <w:tcW w:w="1200" w:type="dxa"/>
+            <w:tcBorders>
+              <w:top w:val="single" w:sz="4" w:space="0" w:color="A6A6A6"/>
+              <w:left w:val="single" w:sz="4" w:space="0" w:color="A6A6A6"/>
+              <w:bottom w:val="single" w:sz="4" w:space="0" w:color="A6A6A6"/>
+              <w:right w:val="single" w:sz="4" w:space="0" w:color="A6A6A6"/>
+            </w:tcBorders>
+            <w:tcMar>
+              <w:top w:w="60" w:type="dxa"/>
+              <w:left w:w="90" w:type="dxa"/>
+              <w:bottom w:w="60" w:type="dxa"/>
+              <w:right w:w="90" w:type="dxa"/>
+            </w:tcMar>
+          </w:tcPr>
+          <w:p>
+            <w:r>
+              <w:rPr>
+                <w:sz w:val="19"/>
+                <w:szCs w:val="19"/>
+              </w:rPr>
+              <w:t xml:space="preserve">OP-N74 (ADR-120)</w:t>
+            </w:r>
+          </w:p>
+        </w:tc>
+        <w:tc>
+          <w:tcPr>
+            <w:tcW w:w="4000" w:type="dxa"/>
+            <w:tcBorders>
+              <w:top w:val="single" w:sz="4" w:space="0" w:color="A6A6A6"/>
+              <w:left w:val="single" w:sz="4" w:space="0" w:color="A6A6A6"/>
+              <w:bottom w:val="single" w:sz="4" w:space="0" w:color="A6A6A6"/>
+              <w:right w:val="single" w:sz="4" w:space="0" w:color="A6A6A6"/>
+            </w:tcBorders>
+            <w:tcMar>
+              <w:top w:w="60" w:type="dxa"/>
+              <w:left w:w="90" w:type="dxa"/>
+              <w:bottom w:w="60" w:type="dxa"/>
+              <w:right w:w="90" w:type="dxa"/>
+            </w:tcMar>
+          </w:tcPr>
+          <w:p>
+            <w:r>
+              <w:rPr>
+                <w:sz w:val="19"/>
+                <w:szCs w:val="19"/>
+              </w:rPr>
+              <w:t xml:space="preserve">Un code peut viser un événement clos ou un point de vente supprimé</w:t>
+            </w:r>
+          </w:p>
+        </w:tc>
+        <w:tc>
+          <w:tcPr>
+            <w:tcW w:w="4438" w:type="dxa"/>
+            <w:tcBorders>
+              <w:top w:val="single" w:sz="4" w:space="0" w:color="A6A6A6"/>
+              <w:left w:val="single" w:sz="4" w:space="0" w:color="A6A6A6"/>
+              <w:bottom w:val="single" w:sz="4" w:space="0" w:color="A6A6A6"/>
+              <w:right w:val="single" w:sz="4" w:space="0" w:color="A6A6A6"/>
+            </w:tcBorders>
+            <w:tcMar>
+              <w:top w:w="60" w:type="dxa"/>
+              <w:left w:w="90" w:type="dxa"/>
+              <w:bottom w:w="60" w:type="dxa"/>
+              <w:right w:w="90" w:type="dxa"/>
+            </w:tcMar>
+          </w:tcPr>
+          <w:p>
+            <w:r>
+              <w:rPr>
+                <w:sz w:val="19"/>
+                <w:szCs w:val="19"/>
+              </w:rPr>
+              <w:t xml:space="preserve">Ne bloque pas la production ; levée par la mission 5b</w:t>
+            </w:r>
+          </w:p>
+        </w:tc>
+      </w:tr>
+      <w:tr>
+        <w:tc>
+          <w:tcPr>
+            <w:tcW w:w="1200" w:type="dxa"/>
+            <w:tcBorders>
+              <w:top w:val="single" w:sz="4" w:space="0" w:color="A6A6A6"/>
+              <w:left w:val="single" w:sz="4" w:space="0" w:color="A6A6A6"/>
+              <w:bottom w:val="single" w:sz="4" w:space="0" w:color="A6A6A6"/>
+              <w:right w:val="single" w:sz="4" w:space="0" w:color="A6A6A6"/>
+            </w:tcBorders>
+            <w:tcMar>
+              <w:top w:w="60" w:type="dxa"/>
+              <w:left w:w="90" w:type="dxa"/>
+              <w:bottom w:w="60" w:type="dxa"/>
+              <w:right w:w="90" w:type="dxa"/>
+            </w:tcMar>
+          </w:tcPr>
+          <w:p>
+            <w:r>
+              <w:rPr>
+                <w:sz w:val="19"/>
+                <w:szCs w:val="19"/>
+              </w:rPr>
+              <w:t xml:space="preserve">OP-N75 (ADR-114)</w:t>
+            </w:r>
+          </w:p>
+        </w:tc>
+        <w:tc>
+          <w:tcPr>
+            <w:tcW w:w="4000" w:type="dxa"/>
+            <w:tcBorders>
+              <w:top w:val="single" w:sz="4" w:space="0" w:color="A6A6A6"/>
+              <w:left w:val="single" w:sz="4" w:space="0" w:color="A6A6A6"/>
+              <w:bottom w:val="single" w:sz="4" w:space="0" w:color="A6A6A6"/>
+              <w:right w:val="single" w:sz="4" w:space="0" w:color="A6A6A6"/>
+            </w:tcBorders>
+            <w:tcMar>
+              <w:top w:w="60" w:type="dxa"/>
+              <w:left w:w="90" w:type="dxa"/>
+              <w:bottom w:w="60" w:type="dxa"/>
+              <w:right w:w="90" w:type="dxa"/>
+            </w:tcMar>
+          </w:tcPr>
+          <w:p>
+            <w:r>
+              <w:rPr>
+                <w:sz w:val="19"/>
+                <w:szCs w:val="19"/>
+              </w:rPr>
+              <w:t xml:space="preserve">Les purges des nonces et des essais d’enrôlement sont exécutées par l’API publique</w:t>
+            </w:r>
+          </w:p>
+        </w:tc>
+        <w:tc>
+          <w:tcPr>
+            <w:tcW w:w="4438" w:type="dxa"/>
+            <w:tcBorders>
+              <w:top w:val="single" w:sz="4" w:space="0" w:color="A6A6A6"/>
+              <w:left w:val="single" w:sz="4" w:space="0" w:color="A6A6A6"/>
+              <w:bottom w:val="single" w:sz="4" w:space="0" w:color="A6A6A6"/>
+              <w:right w:val="single" w:sz="4" w:space="0" w:color="A6A6A6"/>
+            </w:tcBorders>
+            <w:tcMar>
+              <w:top w:w="60" w:type="dxa"/>
+              <w:left w:w="90" w:type="dxa"/>
+              <w:bottom w:w="60" w:type="dxa"/>
+              <w:right w:w="90" w:type="dxa"/>
+            </w:tcMar>
+          </w:tcPr>
+          <w:p>
+            <w:r>
+              <w:rPr>
+                <w:sz w:val="19"/>
+                <w:szCs w:val="19"/>
+              </w:rPr>
+              <w:t xml:space="preserve">Lignes expirées seulement, fenêtre bornée par un test ; levée par la mission 7</w:t>
+            </w:r>
+          </w:p>
+        </w:tc>
+      </w:tr>
+      <w:tr>
+        <w:tc>
+          <w:tcPr>
+            <w:tcW w:w="1200" w:type="dxa"/>
+            <w:tcBorders>
+              <w:top w:val="single" w:sz="4" w:space="0" w:color="A6A6A6"/>
+              <w:left w:val="single" w:sz="4" w:space="0" w:color="A6A6A6"/>
+              <w:bottom w:val="single" w:sz="4" w:space="0" w:color="A6A6A6"/>
+              <w:right w:val="single" w:sz="4" w:space="0" w:color="A6A6A6"/>
+            </w:tcBorders>
+            <w:tcMar>
+              <w:top w:w="60" w:type="dxa"/>
+              <w:left w:w="90" w:type="dxa"/>
+              <w:bottom w:w="60" w:type="dxa"/>
+              <w:right w:w="90" w:type="dxa"/>
+            </w:tcMar>
+          </w:tcPr>
+          <w:p>
+            <w:r>
+              <w:rPr>
+                <w:sz w:val="19"/>
+                <w:szCs w:val="19"/>
+              </w:rPr>
+              <w:t xml:space="preserve">OP-N56 (ADR-105)</w:t>
+            </w:r>
+          </w:p>
+        </w:tc>
+        <w:tc>
+          <w:tcPr>
+            <w:tcW w:w="4000" w:type="dxa"/>
+            <w:tcBorders>
+              <w:top w:val="single" w:sz="4" w:space="0" w:color="A6A6A6"/>
+              <w:left w:val="single" w:sz="4" w:space="0" w:color="A6A6A6"/>
+              <w:bottom w:val="single" w:sz="4" w:space="0" w:color="A6A6A6"/>
+              <w:right w:val="single" w:sz="4" w:space="0" w:color="A6A6A6"/>
+            </w:tcBorders>
+            <w:tcMar>
+              <w:top w:w="60" w:type="dxa"/>
+              <w:left w:w="90" w:type="dxa"/>
+              <w:bottom w:w="60" w:type="dxa"/>
+              <w:right w:w="90" w:type="dxa"/>
+            </w:tcMar>
+          </w:tcPr>
+          <w:p>
+            <w:r>
+              <w:rPr>
+                <w:sz w:val="19"/>
+                <w:szCs w:val="19"/>
+              </w:rPr>
+              <w:t xml:space="preserve">La base croit l’API pour l’auteur et les preuves d’un enrôlement</w:t>
+            </w:r>
+          </w:p>
+        </w:tc>
+        <w:tc>
+          <w:tcPr>
+            <w:tcW w:w="4438" w:type="dxa"/>
+            <w:tcBorders>
+              <w:top w:val="single" w:sz="4" w:space="0" w:color="A6A6A6"/>
+              <w:left w:val="single" w:sz="4" w:space="0" w:color="A6A6A6"/>
+              <w:bottom w:val="single" w:sz="4" w:space="0" w:color="A6A6A6"/>
+              <w:right w:val="single" w:sz="4" w:space="0" w:color="A6A6A6"/>
+            </w:tcBorders>
+            <w:tcMar>
+              <w:top w:w="60" w:type="dxa"/>
+              <w:left w:w="90" w:type="dxa"/>
+              <w:bottom w:w="60" w:type="dxa"/>
+              <w:right w:w="90" w:type="dxa"/>
+            </w:tcMar>
+          </w:tcPr>
+          <w:p>
+            <w:r>
+              <w:rPr>
+                <w:sz w:val="19"/>
+                <w:szCs w:val="19"/>
+              </w:rPr>
+              <w:t xml:space="preserve">Barrière réelle hors de la base (autorité, signataire) ; empreinte des codes illisible par l’API depuis le correctif post-fusion ; levée par la mission 11</w:t>
             </w:r>
           </w:p>
         </w:tc>
@@ -9760,7 +9516,7 @@
         <w:spacing w:after="120"/>
       </w:pPr>
       <w:r>
-        <w:t xml:space="preserve">Les dettes héritées de la mission 4, à lever par cette mission, en sont à ce point le 20 octobre 2026 :</w:t>
+        <w:t xml:space="preserve">Les dettes héritées de la mission 4 sont toutes levées, chacune avec son test :</w:t>
       </w:r>
     </w:p>
     <w:tbl>
@@ -9948,7 +9704,7 @@
                 <w:sz w:val="19"/>
                 <w:szCs w:val="19"/>
               </w:rPr>
-              <w:t xml:space="preserve">Lot 12, à faire</w:t>
+              <w:t xml:space="preserve">Levée (lot 12) : trois preuves derrière la prise ; faux réservé aux tests</w:t>
             </w:r>
           </w:p>
         </w:tc>
@@ -10028,7 +9784,7 @@
                 <w:sz w:val="19"/>
                 <w:szCs w:val="19"/>
               </w:rPr>
-              <w:t xml:space="preserve">Migration 0021 faite (lot 2) ; retrait du droit TEMPORARY au lot 7, en cours</w:t>
+              <w:t xml:space="preserve">Levée : migration 0021 (lot 2) et retrait du droit TEMPORARY (lot 7)</w:t>
             </w:r>
           </w:p>
         </w:tc>
@@ -10108,7 +9864,7 @@
                 <w:sz w:val="19"/>
                 <w:szCs w:val="19"/>
               </w:rPr>
-              <w:t xml:space="preserve">Lot 7, en cours</w:t>
+              <w:t xml:space="preserve">Levée (lot 7) : chaque rôle n’exécute que ses fonctions</w:t>
             </w:r>
           </w:p>
         </w:tc>
@@ -10268,7 +10024,7 @@
                 <w:sz w:val="19"/>
                 <w:szCs w:val="19"/>
               </w:rPr>
-              <w:t xml:space="preserve">Empreinte à clé faite (lot 13) ; l’empreinte de la personnalisation et la purge des anciennes lignes restent au lot 18</w:t>
+              <w:t xml:space="preserve">Levée : empreinte à clé (lot 13), personnalisation et purge des anciennes lignes (lot 18)</w:t>
             </w:r>
           </w:p>
         </w:tc>
@@ -10348,7 +10104,7 @@
                 <w:sz w:val="19"/>
                 <w:szCs w:val="19"/>
               </w:rPr>
-              <w:t xml:space="preserve">Migration 0025 faite (lot 6) ; retrait du droit direct au lot 7</w:t>
+              <w:t xml:space="preserve">Levée : migration 0025 (lot 6) et retrait du droit direct (lot 7)</w:t>
             </w:r>
           </w:p>
         </w:tc>
@@ -10428,7 +10184,7 @@
                 <w:sz w:val="19"/>
                 <w:szCs w:val="19"/>
               </w:rPr>
-              <w:t xml:space="preserve">Écriture par enroll_device faite (lot 3) ; retrait des droits de l’API au lot 7</w:t>
+              <w:t xml:space="preserve">Levée : écriture par enroll_device (lot 3) et retrait des droits de l’API (lot 7)</w:t>
             </w:r>
           </w:p>
         </w:tc>
@@ -11692,6 +11448,486 @@
           </w:p>
         </w:tc>
       </w:tr>
+      <w:tr>
+        <w:tc>
+          <w:tcPr>
+            <w:tcW w:w="600" w:type="dxa"/>
+            <w:tcBorders>
+              <w:top w:val="single" w:sz="4" w:space="0" w:color="A6A6A6"/>
+              <w:left w:val="single" w:sz="4" w:space="0" w:color="A6A6A6"/>
+              <w:bottom w:val="single" w:sz="4" w:space="0" w:color="A6A6A6"/>
+              <w:right w:val="single" w:sz="4" w:space="0" w:color="A6A6A6"/>
+            </w:tcBorders>
+            <w:tcMar>
+              <w:top w:w="60" w:type="dxa"/>
+              <w:left w:w="90" w:type="dxa"/>
+              <w:bottom w:w="60" w:type="dxa"/>
+              <w:right w:w="90" w:type="dxa"/>
+            </w:tcMar>
+          </w:tcPr>
+          <w:p>
+            <w:r>
+              <w:rPr>
+                <w:sz w:val="19"/>
+                <w:szCs w:val="19"/>
+              </w:rPr>
+              <w:t xml:space="preserve">15</w:t>
+            </w:r>
+          </w:p>
+        </w:tc>
+        <w:tc>
+          <w:tcPr>
+            <w:tcW w:w="4800" w:type="dxa"/>
+            <w:tcBorders>
+              <w:top w:val="single" w:sz="4" w:space="0" w:color="A6A6A6"/>
+              <w:left w:val="single" w:sz="4" w:space="0" w:color="A6A6A6"/>
+              <w:bottom w:val="single" w:sz="4" w:space="0" w:color="A6A6A6"/>
+              <w:right w:val="single" w:sz="4" w:space="0" w:color="A6A6A6"/>
+            </w:tcBorders>
+            <w:tcMar>
+              <w:top w:w="60" w:type="dxa"/>
+              <w:left w:w="90" w:type="dxa"/>
+              <w:bottom w:w="60" w:type="dxa"/>
+              <w:right w:w="90" w:type="dxa"/>
+            </w:tcMar>
+          </w:tcPr>
+          <w:p>
+            <w:r>
+              <w:rPr>
+                <w:sz w:val="19"/>
+                <w:szCs w:val="19"/>
+              </w:rPr>
+              <w:t xml:space="preserve">Au guichet, deux jetons Bearer ne tiennent pas dans l’en-tête Authorization</w:t>
+            </w:r>
+          </w:p>
+        </w:tc>
+        <w:tc>
+          <w:tcPr>
+            <w:tcW w:w="4238" w:type="dxa"/>
+            <w:tcBorders>
+              <w:top w:val="single" w:sz="4" w:space="0" w:color="A6A6A6"/>
+              <w:left w:val="single" w:sz="4" w:space="0" w:color="A6A6A6"/>
+              <w:bottom w:val="single" w:sz="4" w:space="0" w:color="A6A6A6"/>
+              <w:right w:val="single" w:sz="4" w:space="0" w:color="A6A6A6"/>
+            </w:tcBorders>
+            <w:tcMar>
+              <w:top w:w="60" w:type="dxa"/>
+              <w:left w:w="90" w:type="dxa"/>
+              <w:bottom w:w="60" w:type="dxa"/>
+              <w:right w:w="90" w:type="dxa"/>
+            </w:tcMar>
+          </w:tcPr>
+          <w:p>
+            <w:r>
+              <w:rPr>
+                <w:sz w:val="19"/>
+                <w:szCs w:val="19"/>
+              </w:rPr>
+              <w:t xml:space="preserve">Jeton de la personne dans X-Staff-Authorization (ADR-113)</w:t>
+            </w:r>
+          </w:p>
+        </w:tc>
+      </w:tr>
+      <w:tr>
+        <w:tc>
+          <w:tcPr>
+            <w:tcW w:w="600" w:type="dxa"/>
+            <w:tcBorders>
+              <w:top w:val="single" w:sz="4" w:space="0" w:color="A6A6A6"/>
+              <w:left w:val="single" w:sz="4" w:space="0" w:color="A6A6A6"/>
+              <w:bottom w:val="single" w:sz="4" w:space="0" w:color="A6A6A6"/>
+              <w:right w:val="single" w:sz="4" w:space="0" w:color="A6A6A6"/>
+            </w:tcBorders>
+            <w:tcMar>
+              <w:top w:w="60" w:type="dxa"/>
+              <w:left w:w="90" w:type="dxa"/>
+              <w:bottom w:w="60" w:type="dxa"/>
+              <w:right w:w="90" w:type="dxa"/>
+            </w:tcMar>
+          </w:tcPr>
+          <w:p>
+            <w:r>
+              <w:rPr>
+                <w:sz w:val="19"/>
+                <w:szCs w:val="19"/>
+              </w:rPr>
+              <w:t xml:space="preserve">16</w:t>
+            </w:r>
+          </w:p>
+        </w:tc>
+        <w:tc>
+          <w:tcPr>
+            <w:tcW w:w="4800" w:type="dxa"/>
+            <w:tcBorders>
+              <w:top w:val="single" w:sz="4" w:space="0" w:color="A6A6A6"/>
+              <w:left w:val="single" w:sz="4" w:space="0" w:color="A6A6A6"/>
+              <w:bottom w:val="single" w:sz="4" w:space="0" w:color="A6A6A6"/>
+              <w:right w:val="single" w:sz="4" w:space="0" w:color="A6A6A6"/>
+            </w:tcBorders>
+            <w:tcMar>
+              <w:top w:w="60" w:type="dxa"/>
+              <w:left w:w="90" w:type="dxa"/>
+              <w:bottom w:w="60" w:type="dxa"/>
+              <w:right w:w="90" w:type="dxa"/>
+            </w:tcMar>
+          </w:tcPr>
+          <w:p>
+            <w:r>
+              <w:rPr>
+                <w:sz w:val="19"/>
+                <w:szCs w:val="19"/>
+              </w:rPr>
+              <w:t xml:space="preserve">Le rejeu d’idempotence pouvait viser une autre ressource ou une autre personne</w:t>
+            </w:r>
+          </w:p>
+        </w:tc>
+        <w:tc>
+          <w:tcPr>
+            <w:tcW w:w="4238" w:type="dxa"/>
+            <w:tcBorders>
+              <w:top w:val="single" w:sz="4" w:space="0" w:color="A6A6A6"/>
+              <w:left w:val="single" w:sz="4" w:space="0" w:color="A6A6A6"/>
+              <w:bottom w:val="single" w:sz="4" w:space="0" w:color="A6A6A6"/>
+              <w:right w:val="single" w:sz="4" w:space="0" w:color="A6A6A6"/>
+            </w:tcBorders>
+            <w:tcMar>
+              <w:top w:w="60" w:type="dxa"/>
+              <w:left w:w="90" w:type="dxa"/>
+              <w:bottom w:w="60" w:type="dxa"/>
+              <w:right w:w="90" w:type="dxa"/>
+            </w:tcMar>
+          </w:tcPr>
+          <w:p>
+            <w:r>
+              <w:rPr>
+                <w:sz w:val="19"/>
+                <w:szCs w:val="19"/>
+              </w:rPr>
+              <w:t xml:space="preserve">Chemin concret et appelant dans l’empreinte, 409 sur toutes les routes (ADR-116, OP-N71)</w:t>
+            </w:r>
+          </w:p>
+        </w:tc>
+      </w:tr>
+      <w:tr>
+        <w:tc>
+          <w:tcPr>
+            <w:tcW w:w="600" w:type="dxa"/>
+            <w:tcBorders>
+              <w:top w:val="single" w:sz="4" w:space="0" w:color="A6A6A6"/>
+              <w:left w:val="single" w:sz="4" w:space="0" w:color="A6A6A6"/>
+              <w:bottom w:val="single" w:sz="4" w:space="0" w:color="A6A6A6"/>
+              <w:right w:val="single" w:sz="4" w:space="0" w:color="A6A6A6"/>
+            </w:tcBorders>
+            <w:tcMar>
+              <w:top w:w="60" w:type="dxa"/>
+              <w:left w:w="90" w:type="dxa"/>
+              <w:bottom w:w="60" w:type="dxa"/>
+              <w:right w:w="90" w:type="dxa"/>
+            </w:tcMar>
+          </w:tcPr>
+          <w:p>
+            <w:r>
+              <w:rPr>
+                <w:sz w:val="19"/>
+                <w:szCs w:val="19"/>
+              </w:rPr>
+              <w:t xml:space="preserve">17</w:t>
+            </w:r>
+          </w:p>
+        </w:tc>
+        <w:tc>
+          <w:tcPr>
+            <w:tcW w:w="4800" w:type="dxa"/>
+            <w:tcBorders>
+              <w:top w:val="single" w:sz="4" w:space="0" w:color="A6A6A6"/>
+              <w:left w:val="single" w:sz="4" w:space="0" w:color="A6A6A6"/>
+              <w:bottom w:val="single" w:sz="4" w:space="0" w:color="A6A6A6"/>
+              <w:right w:val="single" w:sz="4" w:space="0" w:color="A6A6A6"/>
+            </w:tcBorders>
+            <w:tcMar>
+              <w:top w:w="60" w:type="dxa"/>
+              <w:left w:w="90" w:type="dxa"/>
+              <w:bottom w:w="60" w:type="dxa"/>
+              <w:right w:w="90" w:type="dxa"/>
+            </w:tcMar>
+          </w:tcPr>
+          <w:p>
+            <w:r>
+              <w:rPr>
+                <w:sz w:val="19"/>
+                <w:szCs w:val="19"/>
+              </w:rPr>
+              <w:t xml:space="preserve">Un refus d’enrôlement pouvait révéler qu’un code existe ; les limites n’étaient pas atomiques</w:t>
+            </w:r>
+          </w:p>
+        </w:tc>
+        <w:tc>
+          <w:tcPr>
+            <w:tcW w:w="4238" w:type="dxa"/>
+            <w:tcBorders>
+              <w:top w:val="single" w:sz="4" w:space="0" w:color="A6A6A6"/>
+              <w:left w:val="single" w:sz="4" w:space="0" w:color="A6A6A6"/>
+              <w:bottom w:val="single" w:sz="4" w:space="0" w:color="A6A6A6"/>
+              <w:right w:val="single" w:sz="4" w:space="0" w:color="A6A6A6"/>
+            </w:tcBorders>
+            <w:tcMar>
+              <w:top w:w="60" w:type="dxa"/>
+              <w:left w:w="90" w:type="dxa"/>
+              <w:bottom w:w="60" w:type="dxa"/>
+              <w:right w:w="90" w:type="dxa"/>
+            </w:tcMar>
+          </w:tcPr>
+          <w:p>
+            <w:r>
+              <w:rPr>
+                <w:sz w:val="19"/>
+                <w:szCs w:val="19"/>
+              </w:rPr>
+              <w:t xml:space="preserve">Audit de tous les refus, limites sur les refus seuls, atomiques en base, /64 en IPv6 (ADR-117, migrations 0027 et 0030)</w:t>
+            </w:r>
+          </w:p>
+        </w:tc>
+      </w:tr>
+      <w:tr>
+        <w:tc>
+          <w:tcPr>
+            <w:tcW w:w="600" w:type="dxa"/>
+            <w:tcBorders>
+              <w:top w:val="single" w:sz="4" w:space="0" w:color="A6A6A6"/>
+              <w:left w:val="single" w:sz="4" w:space="0" w:color="A6A6A6"/>
+              <w:bottom w:val="single" w:sz="4" w:space="0" w:color="A6A6A6"/>
+              <w:right w:val="single" w:sz="4" w:space="0" w:color="A6A6A6"/>
+            </w:tcBorders>
+            <w:tcMar>
+              <w:top w:w="60" w:type="dxa"/>
+              <w:left w:w="90" w:type="dxa"/>
+              <w:bottom w:w="60" w:type="dxa"/>
+              <w:right w:w="90" w:type="dxa"/>
+            </w:tcMar>
+          </w:tcPr>
+          <w:p>
+            <w:r>
+              <w:rPr>
+                <w:sz w:val="19"/>
+                <w:szCs w:val="19"/>
+              </w:rPr>
+              <w:t xml:space="preserve">18</w:t>
+            </w:r>
+          </w:p>
+        </w:tc>
+        <w:tc>
+          <w:tcPr>
+            <w:tcW w:w="4800" w:type="dxa"/>
+            <w:tcBorders>
+              <w:top w:val="single" w:sz="4" w:space="0" w:color="A6A6A6"/>
+              <w:left w:val="single" w:sz="4" w:space="0" w:color="A6A6A6"/>
+              <w:bottom w:val="single" w:sz="4" w:space="0" w:color="A6A6A6"/>
+              <w:right w:val="single" w:sz="4" w:space="0" w:color="A6A6A6"/>
+            </w:tcBorders>
+            <w:tcMar>
+              <w:top w:w="60" w:type="dxa"/>
+              <w:left w:w="90" w:type="dxa"/>
+              <w:bottom w:w="60" w:type="dxa"/>
+              <w:right w:w="90" w:type="dxa"/>
+            </w:tcMar>
+          </w:tcPr>
+          <w:p>
+            <w:r>
+              <w:rPr>
+                <w:sz w:val="19"/>
+                <w:szCs w:val="19"/>
+              </w:rPr>
+              <w:t xml:space="preserve">La configuration servie pouvait être enregistrée pour un terminal révoqué ou une version d’un autre prestataire</w:t>
+            </w:r>
+          </w:p>
+        </w:tc>
+        <w:tc>
+          <w:tcPr>
+            <w:tcW w:w="4238" w:type="dxa"/>
+            <w:tcBorders>
+              <w:top w:val="single" w:sz="4" w:space="0" w:color="A6A6A6"/>
+              <w:left w:val="single" w:sz="4" w:space="0" w:color="A6A6A6"/>
+              <w:bottom w:val="single" w:sz="4" w:space="0" w:color="A6A6A6"/>
+              <w:right w:val="single" w:sz="4" w:space="0" w:color="A6A6A6"/>
+            </w:tcBorders>
+            <w:tcMar>
+              <w:top w:w="60" w:type="dxa"/>
+              <w:left w:w="90" w:type="dxa"/>
+              <w:bottom w:w="60" w:type="dxa"/>
+              <w:right w:w="90" w:type="dxa"/>
+            </w:tcMar>
+          </w:tcPr>
+          <w:p>
+            <w:r>
+              <w:rPr>
+                <w:sz w:val="19"/>
+                <w:szCs w:val="19"/>
+              </w:rPr>
+              <w:t xml:space="preserve">Refus par la fonction de la base elle-même (ADR-118, migration 0029)</w:t>
+            </w:r>
+          </w:p>
+        </w:tc>
+      </w:tr>
+      <w:tr>
+        <w:tc>
+          <w:tcPr>
+            <w:tcW w:w="600" w:type="dxa"/>
+            <w:tcBorders>
+              <w:top w:val="single" w:sz="4" w:space="0" w:color="A6A6A6"/>
+              <w:left w:val="single" w:sz="4" w:space="0" w:color="A6A6A6"/>
+              <w:bottom w:val="single" w:sz="4" w:space="0" w:color="A6A6A6"/>
+              <w:right w:val="single" w:sz="4" w:space="0" w:color="A6A6A6"/>
+            </w:tcBorders>
+            <w:tcMar>
+              <w:top w:w="60" w:type="dxa"/>
+              <w:left w:w="90" w:type="dxa"/>
+              <w:bottom w:w="60" w:type="dxa"/>
+              <w:right w:w="90" w:type="dxa"/>
+            </w:tcMar>
+          </w:tcPr>
+          <w:p>
+            <w:r>
+              <w:rPr>
+                <w:sz w:val="19"/>
+                <w:szCs w:val="19"/>
+              </w:rPr>
+              <w:t xml:space="preserve">19</w:t>
+            </w:r>
+          </w:p>
+        </w:tc>
+        <w:tc>
+          <w:tcPr>
+            <w:tcW w:w="4800" w:type="dxa"/>
+            <w:tcBorders>
+              <w:top w:val="single" w:sz="4" w:space="0" w:color="A6A6A6"/>
+              <w:left w:val="single" w:sz="4" w:space="0" w:color="A6A6A6"/>
+              <w:bottom w:val="single" w:sz="4" w:space="0" w:color="A6A6A6"/>
+              <w:right w:val="single" w:sz="4" w:space="0" w:color="A6A6A6"/>
+            </w:tcBorders>
+            <w:tcMar>
+              <w:top w:w="60" w:type="dxa"/>
+              <w:left w:w="90" w:type="dxa"/>
+              <w:bottom w:w="60" w:type="dxa"/>
+              <w:right w:w="90" w:type="dxa"/>
+            </w:tcMar>
+          </w:tcPr>
+          <w:p>
+            <w:r>
+              <w:rPr>
+                <w:sz w:val="19"/>
+                <w:szCs w:val="19"/>
+              </w:rPr>
+              <w:t xml:space="preserve">Revue après fusion : un code peut viser un événement clos (DRIFT-1)</w:t>
+            </w:r>
+          </w:p>
+        </w:tc>
+        <w:tc>
+          <w:tcPr>
+            <w:tcW w:w="4238" w:type="dxa"/>
+            <w:tcBorders>
+              <w:top w:val="single" w:sz="4" w:space="0" w:color="A6A6A6"/>
+              <w:left w:val="single" w:sz="4" w:space="0" w:color="A6A6A6"/>
+              <w:bottom w:val="single" w:sz="4" w:space="0" w:color="A6A6A6"/>
+              <w:right w:val="single" w:sz="4" w:space="0" w:color="A6A6A6"/>
+            </w:tcBorders>
+            <w:tcMar>
+              <w:top w:w="60" w:type="dxa"/>
+              <w:left w:w="90" w:type="dxa"/>
+              <w:bottom w:w="60" w:type="dxa"/>
+              <w:right w:w="90" w:type="dxa"/>
+            </w:tcMar>
+          </w:tcPr>
+          <w:p>
+            <w:r>
+              <w:rPr>
+                <w:sz w:val="19"/>
+                <w:szCs w:val="19"/>
+              </w:rPr>
+              <w:t xml:space="preserve">Consigné, levée par la mission 5b (OP-N74, ADR-120 ; porteur, 21/10)</w:t>
+            </w:r>
+          </w:p>
+        </w:tc>
+      </w:tr>
+      <w:tr>
+        <w:tc>
+          <w:tcPr>
+            <w:tcW w:w="600" w:type="dxa"/>
+            <w:tcBorders>
+              <w:top w:val="single" w:sz="4" w:space="0" w:color="A6A6A6"/>
+              <w:left w:val="single" w:sz="4" w:space="0" w:color="A6A6A6"/>
+              <w:bottom w:val="single" w:sz="4" w:space="0" w:color="A6A6A6"/>
+              <w:right w:val="single" w:sz="4" w:space="0" w:color="A6A6A6"/>
+            </w:tcBorders>
+            <w:tcMar>
+              <w:top w:w="60" w:type="dxa"/>
+              <w:left w:w="90" w:type="dxa"/>
+              <w:bottom w:w="60" w:type="dxa"/>
+              <w:right w:w="90" w:type="dxa"/>
+            </w:tcMar>
+          </w:tcPr>
+          <w:p>
+            <w:r>
+              <w:rPr>
+                <w:sz w:val="19"/>
+                <w:szCs w:val="19"/>
+              </w:rPr>
+              <w:t xml:space="preserve">20</w:t>
+            </w:r>
+          </w:p>
+        </w:tc>
+        <w:tc>
+          <w:tcPr>
+            <w:tcW w:w="4800" w:type="dxa"/>
+            <w:tcBorders>
+              <w:top w:val="single" w:sz="4" w:space="0" w:color="A6A6A6"/>
+              <w:left w:val="single" w:sz="4" w:space="0" w:color="A6A6A6"/>
+              <w:bottom w:val="single" w:sz="4" w:space="0" w:color="A6A6A6"/>
+              <w:right w:val="single" w:sz="4" w:space="0" w:color="A6A6A6"/>
+            </w:tcBorders>
+            <w:tcMar>
+              <w:top w:w="60" w:type="dxa"/>
+              <w:left w:w="90" w:type="dxa"/>
+              <w:bottom w:w="60" w:type="dxa"/>
+              <w:right w:w="90" w:type="dxa"/>
+            </w:tcMar>
+          </w:tcPr>
+          <w:p>
+            <w:r>
+              <w:rPr>
+                <w:sz w:val="19"/>
+                <w:szCs w:val="19"/>
+              </w:rPr>
+              <w:t xml:space="preserve">Revue après fusion : l’API pouvait lire l’empreinte des codes (SEC-2) ; durée du jeton réglable jusqu’à 1 h en production (DRIFT-2)</w:t>
+            </w:r>
+          </w:p>
+        </w:tc>
+        <w:tc>
+          <w:tcPr>
+            <w:tcW w:w="4238" w:type="dxa"/>
+            <w:tcBorders>
+              <w:top w:val="single" w:sz="4" w:space="0" w:color="A6A6A6"/>
+              <w:left w:val="single" w:sz="4" w:space="0" w:color="A6A6A6"/>
+              <w:bottom w:val="single" w:sz="4" w:space="0" w:color="A6A6A6"/>
+              <w:right w:val="single" w:sz="4" w:space="0" w:color="A6A6A6"/>
+            </w:tcBorders>
+            <w:tcMar>
+              <w:top w:w="60" w:type="dxa"/>
+              <w:left w:w="90" w:type="dxa"/>
+              <w:bottom w:w="60" w:type="dxa"/>
+              <w:right w:w="90" w:type="dxa"/>
+            </w:tcMar>
+          </w:tcPr>
+          <w:p>
+            <w:r>
+              <w:rPr>
+                <w:sz w:val="19"/>
+                <w:szCs w:val="19"/>
+              </w:rPr>
+              <w:t xml:space="preserve">Correctif post-fusion n° 1 (porteur, 21/10) : empreinte illisible par l’API, aussi dans la table des essais ; 900 s au plus en production</w:t>
+            </w:r>
+          </w:p>
+        </w:tc>
+      </w:tr>
     </w:tbl>
     <w:p>
       <w:pPr>
@@ -11708,7 +11944,7 @@
         <w:spacing w:after="120"/>
       </w:pPr>
       <w:r>
-        <w:t xml:space="preserve">Chaque lot est relu par un agent distinct de celui qui l’a écrit, dans une session séparée ; le verdict est enregistré par l’orchestrateur. Ce n’est pas une relecture par une personne. Fichiers à faire relire par une personne, selon les comptes rendus des lots : packages/ledger-sql/migrations/0022 à 0025 et post-roles.sql (droits de la base, verrous, révocation de famille) ; apps/api/src/attestation (android-key-attestation.ts, enrollment-challenge.ts, google-revocation-cache.ts, ios-app-attest.ts, attestation.module.ts) ; apps/api/src/device-ca et src/device-tokens (clés, certificats, jetons) ; apps/api/src/idempotency/request-hash.ts et src/enrollment-code/enrollment-code.ts (secrets). La liste complète est dressée au lot 18.</w:t>
+        <w:t xml:space="preserve">Chaque lot est relu par un agent distinct de celui qui l’a écrit, dans une session séparée ; le verdict est enregistré par l’orchestrateur. La revue après fusion (mission-review-report.md, PASS WITH NOTES) et la relecture du correctif post-fusion (post-merge-fix-1-review.md, approuvé) sont faites aussi par des agents. Ce n’est pas une relecture par une personne. Fichiers à faire relire par une personne avant la production : packages/ledger-sql/migrations/0021 à 0030 et post-roles.sql (droits de la base, verrous, révocation de famille, empreinte des codes) ; tests/tests_device_rights.sql ; apps/api/src/attestation ; apps/api/src/device-ca et src/device-tokens (clés, certificats, jetons) ; apps/api/src/config/config.ts ; apps/api/src/idempotency/request-hash.ts et src/enrollment-code/enrollment-code.ts (secrets). La liste détaillée est dans mission-review-report.md.</w:t>
       </w:r>
     </w:p>
     <w:p>
@@ -12818,7 +13054,7 @@
                 <w:sz w:val="19"/>
                 <w:szCs w:val="19"/>
               </w:rPr>
-              <w:t xml:space="preserve">En cours</w:t>
+              <w:t xml:space="preserve">Approuvé</w:t>
             </w:r>
           </w:p>
         </w:tc>
@@ -13478,7 +13714,7 @@
                 <w:sz w:val="19"/>
                 <w:szCs w:val="19"/>
               </w:rPr>
-              <w:t xml:space="preserve">À faire</w:t>
+              <w:t xml:space="preserve">Approuvé</w:t>
             </w:r>
           </w:p>
         </w:tc>
@@ -13742,7 +13978,7 @@
                 <w:sz w:val="19"/>
                 <w:szCs w:val="19"/>
               </w:rPr>
-              <w:t xml:space="preserve">À faire</w:t>
+              <w:t xml:space="preserve">Approuvé</w:t>
             </w:r>
           </w:p>
         </w:tc>
@@ -13874,7 +14110,7 @@
                 <w:sz w:val="19"/>
                 <w:szCs w:val="19"/>
               </w:rPr>
-              <w:t xml:space="preserve">À faire</w:t>
+              <w:t xml:space="preserve">Approuvé</w:t>
             </w:r>
           </w:p>
         </w:tc>
@@ -14006,7 +14242,7 @@
                 <w:sz w:val="19"/>
                 <w:szCs w:val="19"/>
               </w:rPr>
-              <w:t xml:space="preserve">À faire</w:t>
+              <w:t xml:space="preserve">Approuvé</w:t>
             </w:r>
           </w:p>
         </w:tc>
@@ -14138,7 +14374,7 @@
                 <w:sz w:val="19"/>
                 <w:szCs w:val="19"/>
               </w:rPr>
-              <w:t xml:space="preserve">À faire</w:t>
+              <w:t xml:space="preserve">Approuvé</w:t>
             </w:r>
           </w:p>
         </w:tc>
@@ -14270,7 +14506,7 @@
                 <w:sz w:val="19"/>
                 <w:szCs w:val="19"/>
               </w:rPr>
-              <w:t xml:space="preserve">À faire</w:t>
+              <w:t xml:space="preserve">Approuvé</w:t>
             </w:r>
           </w:p>
         </w:tc>
@@ -14281,7 +14517,7 @@
         <w:spacing w:after="120"/>
       </w:pPr>
       <w:r>
-        <w:t xml:space="preserve">Trois lots ont été rejetés une fois avant d’être approuvés au second cycle. WP03 : des refus et des contraintes de table n’avaient pas de test (69 assertions au second cycle). WP04 : la révocation de famille pouvait manquer un jeton créé par un échange concurrent. WP10 : trois contrôles de la chaîne Android (émetteur autorité, chaînage par nom, dates de chaque certificat) n’avaient aucun test de refus.</w:t>
+        <w:t xml:space="preserve">Quatre lots ont été rejetés une fois avant d’être approuvés au second cycle. WP03 : des refus et des contraintes de table n’avaient pas de test (69 assertions au second cycle). WP04 : la révocation de famille pouvait manquer un jeton créé par un échange concurrent. WP10 : trois contrôles de la chaîne Android (émetteur autorité, chaînage par nom, dates de chaque certificat) n’avaient aucun test de refus. WP14 : second cycle de relecture. WP18 a été approuvé sous trois réserves (dette de l’autorité et du signataire à nommer, report de DEVICE_REQUEST_AUTHORITIES, vue d’ensemble des points ouverts), consignées le 21 octobre (OP-N73, ADR-119).</w:t>
       </w:r>
     </w:p>
     <w:p>
@@ -14900,7 +15136,7 @@
                 <w:sz w:val="19"/>
                 <w:szCs w:val="19"/>
               </w:rPr>
-              <w:t xml:space="preserve">Trois passages ; le point élevé levé par la décision « événement obligatoire » ; deux écarts mineurs à corriger</w:t>
+              <w:t xml:space="preserve">Trois passages ; le point élevé levé par la décision « événement obligatoire » ; les deux écarts mineurs corrigés</w:t>
             </w:r>
           </w:p>
         </w:tc>
@@ -14954,7 +15190,7 @@
                 <w:sz w:val="19"/>
                 <w:szCs w:val="19"/>
               </w:rPr>
-              <w:t xml:space="preserve">En cours</w:t>
+              <w:t xml:space="preserve">Terminée</w:t>
             </w:r>
           </w:p>
         </w:tc>
@@ -14980,7 +15216,7 @@
                 <w:sz w:val="19"/>
                 <w:szCs w:val="19"/>
               </w:rPr>
-              <w:t xml:space="preserve">11 lots sur 18 approuvés au 20 octobre 2026 ; WP07 en cours ; reste WP12 et WP14 à WP18</w:t>
+              <w:t xml:space="preserve">18 lots sur 18 approuvés le 21 octobre 2026</w:t>
             </w:r>
           </w:p>
         </w:tc>
@@ -15034,7 +15270,7 @@
                 <w:sz w:val="19"/>
                 <w:szCs w:val="19"/>
               </w:rPr>
-              <w:t xml:space="preserve">Vertes en local</w:t>
+              <w:t xml:space="preserve">Vertes</w:t>
             </w:r>
           </w:p>
         </w:tc>
@@ -15060,7 +15296,7 @@
                 <w:sz w:val="19"/>
                 <w:szCs w:val="19"/>
               </w:rPr>
-              <w:t xml:space="preserve">1 411 tests de l’API sur 1 411 sur la lane de WP11 ; 1 322 sur 1 322 sur celle de WP13 ; total des assertions de la base non relevé</w:t>
+              <w:t xml:space="preserve">pgTAP 2083/2083 ; API 1704 réussis, 6 ignorés ; latence 17/17. GitHub Actions vert sur la branche le 22 octobre 2026 (run 39762590535) : pgTAP 2083/2083, Jest 1705 réussis et 6 ignorés, bibliothèque de format 39/39, mesures de latence en série vertes (NFR-011 tenue).</w:t>
             </w:r>
           </w:p>
         </w:tc>
@@ -15114,7 +15350,7 @@
                 <w:sz w:val="19"/>
                 <w:szCs w:val="19"/>
               </w:rPr>
-              <w:t xml:space="preserve">À faire</w:t>
+              <w:t xml:space="preserve">Terminée</w:t>
             </w:r>
           </w:p>
         </w:tc>
@@ -15140,7 +15376,7 @@
                 <w:sz w:val="19"/>
                 <w:szCs w:val="19"/>
               </w:rPr>
-              <w:t xml:space="preserve">Les lots approuvés sont dans leurs lanes, pas encore dans feat/identite-enrolement-terminaux</w:t>
+              <w:t xml:space="preserve">Lanes fusionnées dans la lane du lot 18, puis dans feat/identite-enrolement-terminaux</w:t>
             </w:r>
           </w:p>
         </w:tc>
@@ -15194,7 +15430,7 @@
                 <w:sz w:val="19"/>
                 <w:szCs w:val="19"/>
               </w:rPr>
-              <w:t xml:space="preserve">À faire</w:t>
+              <w:t xml:space="preserve">À jour</w:t>
             </w:r>
           </w:p>
         </w:tc>
@@ -15220,7 +15456,7 @@
                 <w:sz w:val="19"/>
                 <w:szCs w:val="19"/>
               </w:rPr>
-              <w:t xml:space="preserve">Après le lot 18, avant l’acceptation</w:t>
+              <w:t xml:space="preserve">21 octobre 2026, avant l’acceptation ; complétée après le correctif post-fusion le 22 octobre</w:t>
             </w:r>
           </w:p>
         </w:tc>
@@ -15274,7 +15510,7 @@
                 <w:sz w:val="19"/>
                 <w:szCs w:val="19"/>
               </w:rPr>
-              <w:t xml:space="preserve">À faire</w:t>
+              <w:t xml:space="preserve">Terminée</w:t>
             </w:r>
           </w:p>
         </w:tc>
@@ -15300,7 +15536,7 @@
                 <w:sz w:val="19"/>
                 <w:szCs w:val="19"/>
               </w:rPr>
-              <w:t xml:space="preserve">Dans feat/identite-enrolement-terminaux, puis demande de fusion vers main</w:t>
+              <w:t xml:space="preserve">Acceptée le 21 octobre (matrice : 26 exigences, 12 invariants) ; fusionnée dans feat/identite-enrolement-terminaux ; PR #4 vers main ouverte le 22 octobre</w:t>
             </w:r>
           </w:p>
         </w:tc>
@@ -15354,7 +15590,7 @@
                 <w:sz w:val="19"/>
                 <w:szCs w:val="19"/>
               </w:rPr>
-              <w:t xml:space="preserve">À faire</w:t>
+              <w:t xml:space="preserve">Verte</w:t>
             </w:r>
           </w:p>
         </w:tc>
@@ -15380,7 +15616,7 @@
                 <w:sz w:val="19"/>
                 <w:szCs w:val="19"/>
               </w:rPr>
-              <w:t xml:space="preserve">Au lot 18</w:t>
+              <w:t xml:space="preserve">GitHub Actions vert sur la branche le 22 octobre 2026 (run 39762590535) : pgTAP 2083/2083, Jest 1705 réussis et 6 ignorés, bibliothèque de format 39/39, mesures de latence en série vertes (NFR-011 tenue).</w:t>
             </w:r>
           </w:p>
         </w:tc>
@@ -15434,7 +15670,7 @@
                 <w:sz w:val="19"/>
                 <w:szCs w:val="19"/>
               </w:rPr>
-              <w:t xml:space="preserve">À faire</w:t>
+              <w:t xml:space="preserve">Terminée</w:t>
             </w:r>
           </w:p>
         </w:tc>
@@ -15460,7 +15696,7 @@
                 <w:sz w:val="19"/>
                 <w:szCs w:val="19"/>
               </w:rPr>
-              <w:t xml:space="preserve">Doit lister les écarts de sécurité ouverts</w:t>
+              <w:t xml:space="preserve">PASS WITH NOTES ; correctif post-fusion n° 1 (SEC-2, DRIFT-2) fait et approuvé le 22 octobre ; autres constats consignés</w:t>
             </w:r>
           </w:p>
         </w:tc>
@@ -15471,7 +15707,7 @@
         <w:spacing w:after="120"/>
       </w:pPr>
       <w:r>
-        <w:t xml:space="preserve">Reste à faire : finir WP07, puis WP12 et WP14 à WP18 ; fusionner les lanes ; corriger les deux écarts mineurs de l’analyse ; mettre à jour la documentation ; accepter, fusionner et relire la mission ; faire relire par une personne les fichiers listés en 7.4. Les sources consultées ne montrent aucune question en attente du porteur au 20 octobre 2026. Ce document sera mis à jour à la fin de la mission.</w:t>
+        <w:t xml:space="preserve">Reste à faire : fusionner la PR #4 dans main (CI verte) ; faire relire par une personne les fichiers listés en 7.4 ; trancher pour OP-N68 et OP-N69 la question « bloque la production » ; lever OP-N73 avec la mission 7 avant toute mise en production. La mission suivante est la 5b (encaissement en ligne), qui hérite d’OP-N74.</w:t>
       </w:r>
     </w:p>
     <w:sectPr>

</xml_diff>